<commit_message>
Spread Report letterhead to inmate paper and fix barcode indentation
Applies the Report letterhead (via backend/scripts/apply_report_letterhead.py) to the Report and Inmate Conduct Violations templates, prints the submitter G-number in their footers, keeps the Report date DD/MM/YYYY, and repairs the IndentationError left in docx_engine.py by 48070bdf.
</commit_message>
<xml_diff>
--- a/backend/templates/GSSG-GS_300-004_Report.docx
+++ b/backend/templates/GSSG-GS_300-004_Report.docx
@@ -12,26 +12,6 @@
           <w:rtl/>
         </w:rPr>
       </w:pPr>
-      <w:r>
-        <w:rPr>
-          <w:rFonts w:ascii="Sakkal Majalla" w:hAnsi="Sakkal Majalla" w:cs="Sakkal Majalla" w:hint="cs"/>
-          <w:sz w:val="32"/>
-          <w:szCs w:val="32"/>
-          <w:rtl/>
-        </w:rPr>
-        <w:t>التاريخ: {{ date }}</w:t>
-      </w:r>
-    </w:p>
-    <w:p>
-      <w:pPr>
-        <w:bidi/>
-        <w:rPr>
-          <w:rFonts w:ascii="Sakkal Majalla" w:hAnsi="Sakkal Majalla" w:cs="Sakkal Majalla"/>
-          <w:sz w:val="32"/>
-          <w:szCs w:val="32"/>
-          <w:rtl/>
-        </w:rPr>
-      </w:pPr>
     </w:p>
     <w:p>
       <w:pPr>
@@ -53,29 +33,94 @@
           <w:szCs w:val="32"/>
           <w:rtl/>
         </w:rPr>
-        <w:t>السيد {{ recipient_name }}</w:t>
-      </w:r>
-      <w:r>
-        <w:rPr>
-          <w:rFonts w:ascii="Sakkal Majalla" w:hAnsi="Sakkal Majalla" w:cs="Sakkal Majalla" w:hint="cs"/>
-          <w:sz w:val="32"/>
-          <w:szCs w:val="32"/>
-          <w:rtl/>
-        </w:rPr>
-        <w:tab/>
-        <w:t xml:space="preserve">المحترم </w:t>
-      </w:r>
-    </w:p>
-    <w:p>
-      <w:pPr>
-        <w:bidi/>
+        <w:t>السيد</w:t>
+      </w:r>
+      <w:r>
         <w:rPr>
           <w:rFonts w:ascii="Sakkal Majalla" w:hAnsi="Sakkal Majalla" w:cs="Sakkal Majalla"/>
           <w:sz w:val="32"/>
           <w:szCs w:val="32"/>
-          <w:rtl/>
-        </w:rPr>
-      </w:pPr>
+        </w:rPr>
+        <w:t>/</w:t>
+      </w:r>
+      <w:r>
+        <w:rPr>
+          <w:rFonts w:ascii="Sakkal Majalla" w:hAnsi="Sakkal Majalla" w:cs="Sakkal Majalla" w:hint="cs"/>
+          <w:sz w:val="32"/>
+          <w:szCs w:val="32"/>
+          <w:rtl/>
+        </w:rPr>
+        <w:t xml:space="preserve"> </w:t>
+      </w:r>
+      <w:proofErr w:type="gramStart"/>
+      <w:r>
+        <w:rPr>
+          <w:rFonts w:ascii="Sakkal Majalla" w:hAnsi="Sakkal Majalla" w:cs="Sakkal Majalla" w:hint="cs"/>
+          <w:sz w:val="32"/>
+          <w:szCs w:val="32"/>
+          <w:rtl/>
+        </w:rPr>
+        <w:t xml:space="preserve">{{ </w:t>
+      </w:r>
+      <w:proofErr w:type="spellStart"/>
+      <w:r>
+        <w:rPr>
+          <w:rFonts w:ascii="Sakkal Majalla" w:hAnsi="Sakkal Majalla" w:cs="Sakkal Majalla" w:hint="cs"/>
+          <w:sz w:val="32"/>
+          <w:szCs w:val="32"/>
+          <w:rtl/>
+        </w:rPr>
+        <w:t>recipient</w:t>
+      </w:r>
+      <w:proofErr w:type="gramEnd"/>
+      <w:r>
+        <w:rPr>
+          <w:rFonts w:ascii="Sakkal Majalla" w:hAnsi="Sakkal Majalla" w:cs="Sakkal Majalla" w:hint="cs"/>
+          <w:sz w:val="32"/>
+          <w:szCs w:val="32"/>
+          <w:rtl/>
+        </w:rPr>
+        <w:t>_</w:t>
+      </w:r>
+      <w:proofErr w:type="gramStart"/>
+      <w:r>
+        <w:rPr>
+          <w:rFonts w:ascii="Sakkal Majalla" w:hAnsi="Sakkal Majalla" w:cs="Sakkal Majalla" w:hint="cs"/>
+          <w:sz w:val="32"/>
+          <w:szCs w:val="32"/>
+          <w:rtl/>
+        </w:rPr>
+        <w:t>name</w:t>
+      </w:r>
+      <w:proofErr w:type="spellEnd"/>
+      <w:r>
+        <w:rPr>
+          <w:rFonts w:ascii="Sakkal Majalla" w:hAnsi="Sakkal Majalla" w:cs="Sakkal Majalla" w:hint="cs"/>
+          <w:sz w:val="32"/>
+          <w:szCs w:val="32"/>
+          <w:rtl/>
+        </w:rPr>
+        <w:t xml:space="preserve"> }}</w:t>
+      </w:r>
+      <w:r>
+        <w:rPr>
+          <w:rFonts w:ascii="Sakkal Majalla" w:hAnsi="Sakkal Majalla" w:cs="Sakkal Majalla" w:hint="cs"/>
+          <w:sz w:val="32"/>
+          <w:szCs w:val="32"/>
+          <w:rtl/>
+        </w:rPr>
+        <w:tab/>
+      </w:r>
+      <w:proofErr w:type="gramEnd"/>
+      <w:r>
+        <w:rPr>
+          <w:rFonts w:ascii="Sakkal Majalla" w:hAnsi="Sakkal Majalla" w:cs="Sakkal Majalla" w:hint="cs"/>
+          <w:sz w:val="32"/>
+          <w:szCs w:val="32"/>
+          <w:rtl/>
+        </w:rPr>
+        <w:t xml:space="preserve">المحترم </w:t>
+      </w:r>
     </w:p>
     <w:p>
       <w:pPr>
@@ -87,15 +132,6 @@
           <w:rtl/>
         </w:rPr>
       </w:pPr>
-      <w:r>
-        <w:rPr>
-          <w:rFonts w:ascii="Sakkal Majalla" w:hAnsi="Sakkal Majalla" w:cs="Sakkal Majalla" w:hint="cs"/>
-          <w:sz w:val="32"/>
-          <w:szCs w:val="32"/>
-          <w:rtl/>
-        </w:rPr>
-        <w:t>تحية طيبة وبعد ،،</w:t>
-      </w:r>
     </w:p>
     <w:p>
       <w:pPr>
@@ -107,26 +143,213 @@
           <w:rtl/>
         </w:rPr>
       </w:pPr>
+      <w:r>
+        <w:rPr>
+          <w:rFonts w:ascii="Sakkal Majalla" w:hAnsi="Sakkal Majalla" w:cs="Sakkal Majalla" w:hint="cs"/>
+          <w:sz w:val="32"/>
+          <w:szCs w:val="32"/>
+          <w:rtl/>
+        </w:rPr>
+        <w:t xml:space="preserve">تحية طيبة </w:t>
+      </w:r>
+      <w:proofErr w:type="gramStart"/>
+      <w:r>
+        <w:rPr>
+          <w:rFonts w:ascii="Sakkal Majalla" w:hAnsi="Sakkal Majalla" w:cs="Sakkal Majalla" w:hint="cs"/>
+          <w:sz w:val="32"/>
+          <w:szCs w:val="32"/>
+          <w:rtl/>
+        </w:rPr>
+        <w:t>وبعد ،</w:t>
+      </w:r>
+      <w:proofErr w:type="gramEnd"/>
+      <w:r>
+        <w:rPr>
+          <w:rFonts w:ascii="Sakkal Majalla" w:hAnsi="Sakkal Majalla" w:cs="Sakkal Majalla" w:hint="cs"/>
+          <w:sz w:val="32"/>
+          <w:szCs w:val="32"/>
+          <w:rtl/>
+        </w:rPr>
+        <w:t>،</w:t>
+      </w:r>
     </w:p>
     <w:p>
       <w:pPr>
         <w:bidi/>
-        <w:jc w:val="center"/>
+        <w:jc w:val="right"/>
         <w:rPr>
           <w:rFonts w:ascii="Sakkal Majalla" w:hAnsi="Sakkal Majalla" w:cs="Sakkal Majalla"/>
           <w:sz w:val="32"/>
           <w:szCs w:val="32"/>
-          <w:rtl/>
-        </w:rPr>
-      </w:pPr>
+          <w:u w:val="single"/>
+          <w:rtl/>
+        </w:rPr>
+      </w:pPr>
+      <w:proofErr w:type="gramStart"/>
       <w:r>
         <w:rPr>
           <w:rFonts w:ascii="Sakkal Majalla" w:hAnsi="Sakkal Majalla" w:cs="Sakkal Majalla" w:hint="cs"/>
           <w:sz w:val="32"/>
           <w:szCs w:val="32"/>
-          <w:rtl/>
-        </w:rPr>
-        <w:t>{{ '' if not subject else 'الموضوع : ' ~ subject }}</w:t>
+          <w:u w:val="single"/>
+          <w:rtl/>
+        </w:rPr>
+        <w:t>{{ '</w:t>
+      </w:r>
+      <w:proofErr w:type="gramEnd"/>
+      <w:r>
+        <w:rPr>
+          <w:rFonts w:ascii="Sakkal Majalla" w:hAnsi="Sakkal Majalla" w:cs="Sakkal Majalla" w:hint="cs"/>
+          <w:sz w:val="32"/>
+          <w:szCs w:val="32"/>
+          <w:u w:val="single"/>
+          <w:rtl/>
+        </w:rPr>
+        <w:t xml:space="preserve">' </w:t>
+      </w:r>
+      <w:proofErr w:type="spellStart"/>
+      <w:r>
+        <w:rPr>
+          <w:rFonts w:ascii="Sakkal Majalla" w:hAnsi="Sakkal Majalla" w:cs="Sakkal Majalla" w:hint="cs"/>
+          <w:sz w:val="32"/>
+          <w:szCs w:val="32"/>
+          <w:u w:val="single"/>
+          <w:rtl/>
+        </w:rPr>
+        <w:t>if</w:t>
+      </w:r>
+      <w:proofErr w:type="spellEnd"/>
+      <w:r>
+        <w:rPr>
+          <w:rFonts w:ascii="Sakkal Majalla" w:hAnsi="Sakkal Majalla" w:cs="Sakkal Majalla" w:hint="cs"/>
+          <w:sz w:val="32"/>
+          <w:szCs w:val="32"/>
+          <w:u w:val="single"/>
+          <w:rtl/>
+        </w:rPr>
+        <w:t xml:space="preserve"> </w:t>
+      </w:r>
+      <w:proofErr w:type="spellStart"/>
+      <w:r>
+        <w:rPr>
+          <w:rFonts w:ascii="Sakkal Majalla" w:hAnsi="Sakkal Majalla" w:cs="Sakkal Majalla" w:hint="cs"/>
+          <w:sz w:val="32"/>
+          <w:szCs w:val="32"/>
+          <w:u w:val="single"/>
+          <w:rtl/>
+        </w:rPr>
+        <w:t>not</w:t>
+      </w:r>
+      <w:proofErr w:type="spellEnd"/>
+      <w:r>
+        <w:rPr>
+          <w:rFonts w:ascii="Sakkal Majalla" w:hAnsi="Sakkal Majalla" w:cs="Sakkal Majalla" w:hint="cs"/>
+          <w:sz w:val="32"/>
+          <w:szCs w:val="32"/>
+          <w:u w:val="single"/>
+          <w:rtl/>
+        </w:rPr>
+        <w:t xml:space="preserve"> </w:t>
+      </w:r>
+      <w:proofErr w:type="spellStart"/>
+      <w:r>
+        <w:rPr>
+          <w:rFonts w:ascii="Sakkal Majalla" w:hAnsi="Sakkal Majalla" w:cs="Sakkal Majalla" w:hint="cs"/>
+          <w:sz w:val="32"/>
+          <w:szCs w:val="32"/>
+          <w:u w:val="single"/>
+          <w:rtl/>
+        </w:rPr>
+        <w:t>subject</w:t>
+      </w:r>
+      <w:proofErr w:type="spellEnd"/>
+      <w:r>
+        <w:rPr>
+          <w:rFonts w:ascii="Sakkal Majalla" w:hAnsi="Sakkal Majalla" w:cs="Sakkal Majalla" w:hint="cs"/>
+          <w:sz w:val="32"/>
+          <w:szCs w:val="32"/>
+          <w:u w:val="single"/>
+          <w:rtl/>
+        </w:rPr>
+        <w:t xml:space="preserve"> </w:t>
+      </w:r>
+      <w:proofErr w:type="spellStart"/>
+      <w:r>
+        <w:rPr>
+          <w:rFonts w:ascii="Sakkal Majalla" w:hAnsi="Sakkal Majalla" w:cs="Sakkal Majalla" w:hint="cs"/>
+          <w:sz w:val="32"/>
+          <w:szCs w:val="32"/>
+          <w:u w:val="single"/>
+          <w:rtl/>
+        </w:rPr>
+        <w:t>else</w:t>
+      </w:r>
+      <w:proofErr w:type="spellEnd"/>
+      <w:r>
+        <w:rPr>
+          <w:rFonts w:ascii="Sakkal Majalla" w:hAnsi="Sakkal Majalla" w:cs="Sakkal Majalla" w:hint="cs"/>
+          <w:sz w:val="32"/>
+          <w:szCs w:val="32"/>
+          <w:u w:val="single"/>
+          <w:rtl/>
+        </w:rPr>
+        <w:t xml:space="preserve"> '</w:t>
+      </w:r>
+      <w:proofErr w:type="gramStart"/>
+      <w:r>
+        <w:rPr>
+          <w:rFonts w:ascii="Sakkal Majalla" w:hAnsi="Sakkal Majalla" w:cs="Sakkal Majalla" w:hint="cs"/>
+          <w:sz w:val="32"/>
+          <w:szCs w:val="32"/>
+          <w:u w:val="single"/>
+          <w:rtl/>
+        </w:rPr>
+        <w:t>الموضوع :</w:t>
+      </w:r>
+      <w:proofErr w:type="gramEnd"/>
+      <w:r>
+        <w:rPr>
+          <w:rFonts w:ascii="Sakkal Majalla" w:hAnsi="Sakkal Majalla" w:cs="Sakkal Majalla" w:hint="cs"/>
+          <w:sz w:val="32"/>
+          <w:szCs w:val="32"/>
+          <w:u w:val="single"/>
+          <w:rtl/>
+        </w:rPr>
+        <w:t xml:space="preserve"> ' ~ </w:t>
+      </w:r>
+      <w:proofErr w:type="spellStart"/>
+      <w:proofErr w:type="gramStart"/>
+      <w:r>
+        <w:rPr>
+          <w:rFonts w:ascii="Sakkal Majalla" w:hAnsi="Sakkal Majalla" w:cs="Sakkal Majalla" w:hint="cs"/>
+          <w:sz w:val="32"/>
+          <w:szCs w:val="32"/>
+          <w:u w:val="single"/>
+          <w:rtl/>
+        </w:rPr>
+        <w:t>subject</w:t>
+      </w:r>
+      <w:proofErr w:type="spellEnd"/>
+      <w:r>
+        <w:rPr>
+          <w:rFonts w:ascii="Sakkal Majalla" w:hAnsi="Sakkal Majalla" w:cs="Sakkal Majalla" w:hint="cs"/>
+          <w:sz w:val="32"/>
+          <w:szCs w:val="32"/>
+          <w:u w:val="single"/>
+          <w:rtl/>
+        </w:rPr>
+        <w:t xml:space="preserve"> }</w:t>
+      </w:r>
+      <w:proofErr w:type="gramEnd"/>
+      <w:r>
+        <w:rPr>
+          <w:rFonts w:ascii="Sakkal Majalla" w:hAnsi="Sakkal Majalla" w:cs="Sakkal Majalla" w:hint="cs"/>
+          <w:sz w:val="32"/>
+          <w:szCs w:val="32"/>
+          <w:u w:val="single"/>
+          <w:rtl/>
+        </w:rPr>
+        <w:t>}</w:t>
       </w:r>
     </w:p>
     <w:p>
@@ -157,13 +380,55 @@
         <w:jc w:val="both"/>
         <w:rPr>
           <w:rFonts w:ascii="Sakkal Majalla" w:hAnsi="Sakkal Majalla" w:cs="Sakkal Majalla"/>
+          <w:sz w:val="32"/>
+          <w:szCs w:val="32"/>
+          <w:rtl/>
+          <w:lang w:val="en-AE" w:bidi="ar-AE"/>
+        </w:rPr>
+      </w:pPr>
+      <w:r>
+        <w:rPr>
+          <w:rFonts w:ascii="Sakkal Majalla" w:hAnsi="Sakkal Majalla" w:cs="Sakkal Majalla" w:hint="cs"/>
+          <w:sz w:val="32"/>
+          <w:szCs w:val="32"/>
+          <w:rtl/>
+          <w:lang w:val="en-AE" w:bidi="ar-AE"/>
+        </w:rPr>
+        <w:t xml:space="preserve">يطيب لنا ان نتقدم لكم بأطيب التحيات </w:t>
+      </w:r>
+      <w:r>
+        <w:rPr>
+          <w:rFonts w:ascii="Sakkal Majalla" w:hAnsi="Sakkal Majalla" w:cs="Sakkal Majalla" w:hint="cs"/>
+          <w:sz w:val="32"/>
+          <w:szCs w:val="32"/>
+          <w:rtl/>
+          <w:lang w:val="en-AE" w:bidi="ar-AE"/>
+        </w:rPr>
+        <w:t>والتقدير،</w:t>
+      </w:r>
+      <w:r>
+        <w:rPr>
+          <w:rFonts w:ascii="Sakkal Majalla" w:hAnsi="Sakkal Majalla" w:cs="Sakkal Majalla" w:hint="cs"/>
+          <w:sz w:val="32"/>
+          <w:szCs w:val="32"/>
+          <w:rtl/>
+          <w:lang w:val="en-AE" w:bidi="ar-AE"/>
+        </w:rPr>
+        <w:t xml:space="preserve"> </w:t>
+      </w:r>
+      <w:proofErr w:type="gramStart"/>
+      <w:r>
+        <w:rPr>
+          <w:rFonts w:ascii="Sakkal Majalla" w:hAnsi="Sakkal Majalla" w:cs="Sakkal Majalla" w:hint="cs"/>
           <w:b/>
           <w:bCs/>
           <w:sz w:val="32"/>
           <w:szCs w:val="32"/>
           <w:rtl/>
         </w:rPr>
-      </w:pPr>
+        <w:t xml:space="preserve">{{ </w:t>
+      </w:r>
+      <w:proofErr w:type="spellStart"/>
       <w:r>
         <w:rPr>
           <w:rFonts w:ascii="Sakkal Majalla" w:hAnsi="Sakkal Majalla" w:cs="Sakkal Majalla" w:hint="cs"/>
@@ -173,7 +438,20 @@
           <w:szCs w:val="32"/>
           <w:rtl/>
         </w:rPr>
-        <w:t>{{ body }}</w:t>
+        <w:t>body</w:t>
+      </w:r>
+      <w:proofErr w:type="spellEnd"/>
+      <w:proofErr w:type="gramEnd"/>
+      <w:r>
+        <w:rPr>
+          <w:rFonts w:ascii="Sakkal Majalla" w:hAnsi="Sakkal Majalla" w:cs="Sakkal Majalla" w:hint="cs"/>
+          <w:b/>
+          <w:bCs/>
+          <w:sz w:val="32"/>
+          <w:szCs w:val="32"/>
+          <w:rtl/>
+        </w:rPr>
+        <w:t xml:space="preserve"> }}</w:t>
       </w:r>
     </w:p>
     <w:p>
@@ -205,12 +483,24 @@
           <w:szCs w:val="32"/>
           <w:rtl/>
         </w:rPr>
-        <w:t>للتفضل بالعلم وإجراءاتكم لطفاً،،</w:t>
-      </w:r>
+        <w:t xml:space="preserve">للتفضل بالعلم وإجراءاتكم </w:t>
+      </w:r>
+      <w:proofErr w:type="gramStart"/>
+      <w:r>
+        <w:rPr>
+          <w:rFonts w:ascii="Sakkal Majalla" w:hAnsi="Sakkal Majalla" w:cs="Sakkal Majalla" w:hint="cs"/>
+          <w:sz w:val="32"/>
+          <w:szCs w:val="32"/>
+          <w:rtl/>
+        </w:rPr>
+        <w:t>لطفاً،،</w:t>
+      </w:r>
+      <w:proofErr w:type="gramEnd"/>
     </w:p>
     <w:p>
       <w:pPr>
         <w:bidi/>
+        <w:jc w:val="center"/>
         <w:rPr>
           <w:rFonts w:ascii="Sakkal Majalla" w:hAnsi="Sakkal Majalla" w:cs="Sakkal Majalla"/>
           <w:sz w:val="32"/>
@@ -218,6 +508,15 @@
           <w:rtl/>
         </w:rPr>
       </w:pPr>
+      <w:r>
+        <w:rPr>
+          <w:rFonts w:ascii="Sakkal Majalla" w:hAnsi="Sakkal Majalla" w:cs="Sakkal Majalla" w:hint="cs"/>
+          <w:sz w:val="32"/>
+          <w:szCs w:val="32"/>
+          <w:rtl/>
+        </w:rPr>
+        <w:t>وتفضلوا بقبول فائق الاحترام والتقدير</w:t>
+      </w:r>
     </w:p>
     <w:p>
       <w:pPr>
@@ -234,125 +533,6 @@
       <w:pPr>
         <w:bidi/>
         <w:jc w:val="center"/>
-        <w:rPr>
-          <w:rFonts w:ascii="Sakkal Majalla" w:hAnsi="Sakkal Majalla" w:cs="Sakkal Majalla"/>
-          <w:sz w:val="32"/>
-          <w:szCs w:val="32"/>
-          <w:rtl/>
-        </w:rPr>
-      </w:pPr>
-      <w:r>
-        <w:rPr>
-          <w:rFonts w:ascii="Sakkal Majalla" w:hAnsi="Sakkal Majalla" w:cs="Sakkal Majalla" w:hint="cs"/>
-          <w:sz w:val="32"/>
-          <w:szCs w:val="32"/>
-          <w:rtl/>
-        </w:rPr>
-        <w:t>وتفضلوا بقبول فائق الاحترام والتقدير</w:t>
-      </w:r>
-    </w:p>
-    <w:p>
-      <w:pPr>
-        <w:bidi/>
-        <w:rPr>
-          <w:rFonts w:ascii="Sakkal Majalla" w:hAnsi="Sakkal Majalla" w:cs="Sakkal Majalla"/>
-          <w:sz w:val="32"/>
-          <w:szCs w:val="32"/>
-          <w:rtl/>
-        </w:rPr>
-      </w:pPr>
-    </w:p>
-    <w:p>
-      <w:pPr>
-        <w:bidi/>
-        <w:rPr>
-          <w:rFonts w:ascii="Sakkal Majalla" w:hAnsi="Sakkal Majalla" w:cs="Sakkal Majalla"/>
-          <w:sz w:val="32"/>
-          <w:szCs w:val="32"/>
-          <w:rtl/>
-        </w:rPr>
-      </w:pPr>
-    </w:p>
-    <w:p>
-      <w:pPr>
-        <w:bidi/>
-        <w:rPr>
-          <w:rFonts w:ascii="Sakkal Majalla" w:hAnsi="Sakkal Majalla" w:cs="Sakkal Majalla"/>
-          <w:sz w:val="32"/>
-          <w:szCs w:val="32"/>
-          <w:rtl/>
-        </w:rPr>
-      </w:pPr>
-    </w:p>
-    <w:p>
-      <w:pPr>
-        <w:bidi/>
-        <w:rPr>
-          <w:rFonts w:ascii="Sakkal Majalla" w:hAnsi="Sakkal Majalla" w:cs="Sakkal Majalla"/>
-          <w:sz w:val="32"/>
-          <w:szCs w:val="32"/>
-          <w:rtl/>
-        </w:rPr>
-      </w:pPr>
-    </w:p>
-    <w:p>
-      <w:pPr>
-        <w:bidi/>
-        <w:rPr>
-          <w:rFonts w:ascii="Sakkal Majalla" w:hAnsi="Sakkal Majalla" w:cs="Sakkal Majalla"/>
-          <w:sz w:val="32"/>
-          <w:szCs w:val="32"/>
-          <w:rtl/>
-        </w:rPr>
-      </w:pPr>
-    </w:p>
-    <w:p>
-      <w:pPr>
-        <w:bidi/>
-        <w:rPr>
-          <w:rFonts w:ascii="Sakkal Majalla" w:hAnsi="Sakkal Majalla" w:cs="Sakkal Majalla"/>
-          <w:sz w:val="32"/>
-          <w:szCs w:val="32"/>
-          <w:rtl/>
-        </w:rPr>
-      </w:pPr>
-    </w:p>
-    <w:p>
-      <w:pPr>
-        <w:bidi/>
-        <w:rPr>
-          <w:rFonts w:ascii="Sakkal Majalla" w:hAnsi="Sakkal Majalla" w:cs="Sakkal Majalla"/>
-          <w:sz w:val="32"/>
-          <w:szCs w:val="32"/>
-          <w:rtl/>
-        </w:rPr>
-      </w:pPr>
-    </w:p>
-    <w:p>
-      <w:pPr>
-        <w:bidi/>
-        <w:rPr>
-          <w:rFonts w:ascii="Sakkal Majalla" w:hAnsi="Sakkal Majalla" w:cs="Sakkal Majalla"/>
-          <w:sz w:val="32"/>
-          <w:szCs w:val="32"/>
-          <w:rtl/>
-        </w:rPr>
-      </w:pPr>
-    </w:p>
-    <w:p>
-      <w:pPr>
-        <w:bidi/>
-        <w:rPr>
-          <w:rFonts w:ascii="Sakkal Majalla" w:hAnsi="Sakkal Majalla" w:cs="Sakkal Majalla"/>
-          <w:sz w:val="32"/>
-          <w:szCs w:val="32"/>
-          <w:rtl/>
-        </w:rPr>
-      </w:pPr>
-    </w:p>
-    <w:p>
-      <w:pPr>
-        <w:bidi/>
         <w:rPr>
           <w:rFonts w:ascii="Sakkal Majalla" w:hAnsi="Sakkal Majalla" w:cs="Sakkal Majalla"/>
           <w:sz w:val="36"/>
@@ -372,8 +552,9 @@
           <w:rtl/>
           <w:lang w:bidi="ar-AE"/>
         </w:rPr>
-        <w:t xml:space="preserve">                                                                         </w:t>
-      </w:r>
+        <w:t xml:space="preserve"/>
+      </w:r>
+      <w:proofErr w:type="gramStart"/>
       <w:r>
         <w:rPr>
           <w:rFonts w:ascii="Sakkal Majalla" w:hAnsi="Sakkal Majalla" w:cs="Sakkal Majalla" w:hint="cs"/>
@@ -381,13 +562,83 @@
           <w:szCs w:val="36"/>
           <w:rtl/>
         </w:rPr>
-        <w:t xml:space="preserve">الإســـــــــــــــــــــــــــــــــــــــــــــــــــــــــــــــــــــــــــم : {{ manager_name }}  </w:t>
+        <w:t>الإســـــــــــــــــــــــــــــــــــــــــــــــــــــــــــــــــــــــــــم :</w:t>
+      </w:r>
+      <w:proofErr w:type="gramEnd"/>
+      <w:r>
+        <w:rPr>
+          <w:rFonts w:ascii="Sakkal Majalla" w:hAnsi="Sakkal Majalla" w:cs="Sakkal Majalla" w:hint="cs"/>
+          <w:sz w:val="36"/>
+          <w:szCs w:val="36"/>
+          <w:rtl/>
+        </w:rPr>
+        <w:t xml:space="preserve"> </w:t>
+      </w:r>
+      <w:proofErr w:type="gramStart"/>
+      <w:r>
+        <w:rPr>
+          <w:rFonts w:ascii="Sakkal Majalla" w:hAnsi="Sakkal Majalla" w:cs="Sakkal Majalla" w:hint="cs"/>
+          <w:sz w:val="36"/>
+          <w:szCs w:val="36"/>
+          <w:rtl/>
+        </w:rPr>
+        <w:t xml:space="preserve">{{ </w:t>
+      </w:r>
+      <w:proofErr w:type="spellStart"/>
+      <w:r>
+        <w:rPr>
+          <w:rFonts w:ascii="Sakkal Majalla" w:hAnsi="Sakkal Majalla" w:cs="Sakkal Majalla" w:hint="cs"/>
+          <w:sz w:val="36"/>
+          <w:szCs w:val="36"/>
+          <w:rtl/>
+        </w:rPr>
+        <w:t>manager</w:t>
+      </w:r>
+      <w:proofErr w:type="gramEnd"/>
+      <w:r>
+        <w:rPr>
+          <w:rFonts w:ascii="Sakkal Majalla" w:hAnsi="Sakkal Majalla" w:cs="Sakkal Majalla" w:hint="cs"/>
+          <w:sz w:val="36"/>
+          <w:szCs w:val="36"/>
+          <w:rtl/>
+        </w:rPr>
+        <w:t>_</w:t>
+      </w:r>
+      <w:proofErr w:type="gramStart"/>
+      <w:r>
+        <w:rPr>
+          <w:rFonts w:ascii="Sakkal Majalla" w:hAnsi="Sakkal Majalla" w:cs="Sakkal Majalla" w:hint="cs"/>
+          <w:sz w:val="36"/>
+          <w:szCs w:val="36"/>
+          <w:rtl/>
+        </w:rPr>
+        <w:t>name</w:t>
+      </w:r>
+      <w:proofErr w:type="spellEnd"/>
+      <w:r>
+        <w:rPr>
+          <w:rFonts w:ascii="Sakkal Majalla" w:hAnsi="Sakkal Majalla" w:cs="Sakkal Majalla" w:hint="cs"/>
+          <w:sz w:val="36"/>
+          <w:szCs w:val="36"/>
+          <w:rtl/>
+        </w:rPr>
+        <w:t xml:space="preserve"> }</w:t>
+      </w:r>
+      <w:proofErr w:type="gramEnd"/>
+      <w:r>
+        <w:rPr>
+          <w:rFonts w:ascii="Sakkal Majalla" w:hAnsi="Sakkal Majalla" w:cs="Sakkal Majalla" w:hint="cs"/>
+          <w:sz w:val="36"/>
+          <w:szCs w:val="36"/>
+          <w:rtl/>
+        </w:rPr>
+        <w:t xml:space="preserve">}  </w:t>
       </w:r>
     </w:p>
     <w:p>
       <w:pPr>
         <w:bidi/>
-        <w:jc w:val="both"/>
+        <w:jc w:val="center"/>
         <w:rPr>
           <w:rFonts w:ascii="Sakkal Majalla" w:hAnsi="Sakkal Majalla" w:cs="Sakkal Majalla"/>
           <w:sz w:val="36"/>
@@ -402,7 +653,87 @@
           <w:szCs w:val="36"/>
           <w:rtl/>
         </w:rPr>
-        <w:t xml:space="preserve">                                                                المسمى الوظيفي : {{ manager_title }} </w:t>
+        <w:t xml:space="preserve">المسمى </w:t>
+      </w:r>
+      <w:proofErr w:type="gramStart"/>
+      <w:r>
+        <w:rPr>
+          <w:rFonts w:ascii="Sakkal Majalla" w:hAnsi="Sakkal Majalla" w:cs="Sakkal Majalla" w:hint="cs"/>
+          <w:sz w:val="36"/>
+          <w:szCs w:val="36"/>
+          <w:rtl/>
+        </w:rPr>
+        <w:t>الوظيفي :</w:t>
+      </w:r>
+      <w:proofErr w:type="gramEnd"/>
+      <w:r>
+        <w:rPr>
+          <w:rFonts w:ascii="Sakkal Majalla" w:hAnsi="Sakkal Majalla" w:cs="Sakkal Majalla" w:hint="cs"/>
+          <w:sz w:val="36"/>
+          <w:szCs w:val="36"/>
+          <w:rtl/>
+        </w:rPr>
+        <w:t xml:space="preserve"> </w:t>
+      </w:r>
+      <w:proofErr w:type="gramStart"/>
+      <w:r>
+        <w:rPr>
+          <w:rFonts w:ascii="Sakkal Majalla" w:hAnsi="Sakkal Majalla" w:cs="Sakkal Majalla" w:hint="cs"/>
+          <w:sz w:val="36"/>
+          <w:szCs w:val="36"/>
+          <w:rtl/>
+        </w:rPr>
+        <w:t xml:space="preserve">{{ </w:t>
+      </w:r>
+      <w:proofErr w:type="spellStart"/>
+      <w:r>
+        <w:rPr>
+          <w:rFonts w:ascii="Sakkal Majalla" w:hAnsi="Sakkal Majalla" w:cs="Sakkal Majalla" w:hint="cs"/>
+          <w:sz w:val="36"/>
+          <w:szCs w:val="36"/>
+          <w:rtl/>
+        </w:rPr>
+        <w:t>manager</w:t>
+      </w:r>
+      <w:proofErr w:type="gramEnd"/>
+      <w:r>
+        <w:rPr>
+          <w:rFonts w:ascii="Sakkal Majalla" w:hAnsi="Sakkal Majalla" w:cs="Sakkal Majalla" w:hint="cs"/>
+          <w:sz w:val="36"/>
+          <w:szCs w:val="36"/>
+          <w:rtl/>
+        </w:rPr>
+        <w:t>_</w:t>
+      </w:r>
+      <w:proofErr w:type="gramStart"/>
+      <w:r>
+        <w:rPr>
+          <w:rFonts w:ascii="Sakkal Majalla" w:hAnsi="Sakkal Majalla" w:cs="Sakkal Majalla" w:hint="cs"/>
+          <w:sz w:val="36"/>
+          <w:szCs w:val="36"/>
+          <w:rtl/>
+        </w:rPr>
+        <w:t>title</w:t>
+      </w:r>
+      <w:proofErr w:type="spellEnd"/>
+      <w:r>
+        <w:rPr>
+          <w:rFonts w:ascii="Sakkal Majalla" w:hAnsi="Sakkal Majalla" w:cs="Sakkal Majalla" w:hint="cs"/>
+          <w:sz w:val="36"/>
+          <w:szCs w:val="36"/>
+          <w:rtl/>
+        </w:rPr>
+        <w:t xml:space="preserve"> }</w:t>
+      </w:r>
+      <w:proofErr w:type="gramEnd"/>
+      <w:r>
+        <w:rPr>
+          <w:rFonts w:ascii="Sakkal Majalla" w:hAnsi="Sakkal Majalla" w:cs="Sakkal Majalla" w:hint="cs"/>
+          <w:sz w:val="36"/>
+          <w:szCs w:val="36"/>
+          <w:rtl/>
+        </w:rPr>
+        <w:t xml:space="preserve">} </w:t>
       </w:r>
     </w:p>
     <w:p>
@@ -423,7 +754,67 @@
           <w:szCs w:val="36"/>
           <w:rtl/>
         </w:rPr>
-        <w:t>التوقيـــــــــــــــــــــــــــــــــــــــــــــــــــــــــــــــــــــع: {{ manager_sig }}</w:t>
+        <w:t xml:space="preserve">التوقيـــــــــــــــــــــــــــــــــــــــــــــــــــــــــــــــــــــع: </w:t>
+      </w:r>
+      <w:proofErr w:type="gramStart"/>
+      <w:r>
+        <w:rPr>
+          <w:rFonts w:ascii="Sakkal Majalla" w:hAnsi="Sakkal Majalla" w:cs="Sakkal Majalla" w:hint="cs"/>
+          <w:sz w:val="36"/>
+          <w:szCs w:val="36"/>
+          <w:rtl/>
+        </w:rPr>
+        <w:t xml:space="preserve">{{ </w:t>
+      </w:r>
+      <w:proofErr w:type="spellStart"/>
+      <w:r>
+        <w:rPr>
+          <w:rFonts w:ascii="Sakkal Majalla" w:hAnsi="Sakkal Majalla" w:cs="Sakkal Majalla" w:hint="cs"/>
+          <w:sz w:val="36"/>
+          <w:szCs w:val="36"/>
+          <w:rtl/>
+        </w:rPr>
+        <w:t>manager</w:t>
+      </w:r>
+      <w:proofErr w:type="gramEnd"/>
+      <w:r>
+        <w:rPr>
+          <w:rFonts w:ascii="Sakkal Majalla" w:hAnsi="Sakkal Majalla" w:cs="Sakkal Majalla" w:hint="cs"/>
+          <w:sz w:val="36"/>
+          <w:szCs w:val="36"/>
+          <w:rtl/>
+        </w:rPr>
+        <w:t>_</w:t>
+      </w:r>
+      <w:proofErr w:type="gramStart"/>
+      <w:r>
+        <w:rPr>
+          <w:rFonts w:ascii="Sakkal Majalla" w:hAnsi="Sakkal Majalla" w:cs="Sakkal Majalla" w:hint="cs"/>
+          <w:sz w:val="36"/>
+          <w:szCs w:val="36"/>
+          <w:rtl/>
+        </w:rPr>
+        <w:t>sig</w:t>
+      </w:r>
+      <w:proofErr w:type="spellEnd"/>
+      <w:r>
+        <w:rPr>
+          <w:rFonts w:ascii="Sakkal Majalla" w:hAnsi="Sakkal Majalla" w:cs="Sakkal Majalla" w:hint="cs"/>
+          <w:sz w:val="36"/>
+          <w:szCs w:val="36"/>
+          <w:rtl/>
+        </w:rPr>
+        <w:t xml:space="preserve"> }</w:t>
+      </w:r>
+      <w:proofErr w:type="gramEnd"/>
+      <w:r>
+        <w:rPr>
+          <w:rFonts w:ascii="Sakkal Majalla" w:hAnsi="Sakkal Majalla" w:cs="Sakkal Majalla" w:hint="cs"/>
+          <w:sz w:val="36"/>
+          <w:szCs w:val="36"/>
+          <w:rtl/>
+        </w:rPr>
+        <w:t>}</w:t>
       </w:r>
     </w:p>
     <w:p>
@@ -859,66 +1250,143 @@
   <w:p>
     <w:r>
       <w:rPr>
-        <w:rFonts w:ascii="Helvetica" w:hAnsi="Helvetica"/>
         <w:noProof/>
-        <w:color w:val="FF0000"/>
-        <w:sz w:val="2"/>
-        <w:szCs w:val="2"/>
+        <w:sz w:val="20"/>
+      </w:rPr>
+      <w:drawing>
+        <wp:anchor distT="0" distB="0" distL="0" distR="0" simplePos="0" relativeHeight="251675648" behindDoc="1" locked="0" layoutInCell="1" allowOverlap="1" wp14:anchorId="284CD001" wp14:editId="6BF2B143">
+          <wp:simplePos x="0" y="0"/>
+          <wp:positionH relativeFrom="page">
+            <wp:posOffset>4889859</wp:posOffset>
+          </wp:positionH>
+          <wp:positionV relativeFrom="page">
+            <wp:posOffset>10137747</wp:posOffset>
+          </wp:positionV>
+          <wp:extent cx="252730" cy="252730"/>
+          <wp:effectExtent l="0" t="0" r="0" b="0"/>
+          <wp:wrapNone/>
+          <wp:docPr id="1960223898" name="Image 7" descr="A red and white phone logo&#10;&#10;AI-generated content may be incorrect."/>
+          <wp:cNvGraphicFramePr>
+            <a:graphicFrameLocks xmlns:a="http://schemas.openxmlformats.org/drawingml/2006/main"/>
+          </wp:cNvGraphicFramePr>
+          <a:graphic xmlns:a="http://schemas.openxmlformats.org/drawingml/2006/main">
+            <a:graphicData uri="http://schemas.openxmlformats.org/drawingml/2006/picture">
+              <pic:pic xmlns:pic="http://schemas.openxmlformats.org/drawingml/2006/picture">
+                <pic:nvPicPr>
+                  <pic:cNvPr id="501461693" name="Image 7" descr="A red and white phone logo&#10;&#10;AI-generated content may be incorrect."/>
+                  <pic:cNvPicPr/>
+                </pic:nvPicPr>
+                <pic:blipFill>
+                  <a:blip r:embed="rId1" cstate="print"/>
+                  <a:stretch>
+                    <a:fillRect/>
+                  </a:stretch>
+                </pic:blipFill>
+                <pic:spPr>
+                  <a:xfrm>
+                    <a:off x="0" y="0"/>
+                    <a:ext cx="252730" cy="252730"/>
+                  </a:xfrm>
+                  <a:prstGeom prst="rect">
+                    <a:avLst/>
+                  </a:prstGeom>
+                </pic:spPr>
+              </pic:pic>
+            </a:graphicData>
+          </a:graphic>
+          <wp14:sizeRelH relativeFrom="margin">
+            <wp14:pctWidth>0</wp14:pctWidth>
+          </wp14:sizeRelH>
+          <wp14:sizeRelV relativeFrom="margin">
+            <wp14:pctHeight>0</wp14:pctHeight>
+          </wp14:sizeRelV>
+        </wp:anchor>
+      </w:drawing>
+    </w:r>
+    <w:r>
+      <w:rPr>
+        <w:noProof/>
+        <w:sz w:val="20"/>
       </w:rPr>
       <mc:AlternateContent>
         <mc:Choice Requires="wps">
           <w:drawing>
-            <wp:anchor distT="0" distB="0" distL="114300" distR="114300" simplePos="0" relativeHeight="251659264" behindDoc="1" locked="0" layoutInCell="1" allowOverlap="1" wp14:anchorId="038F823B" wp14:editId="3383CBA7">
+            <wp:anchor distT="0" distB="0" distL="0" distR="0" simplePos="0" relativeHeight="251669504" behindDoc="1" locked="0" layoutInCell="1" allowOverlap="1" wp14:anchorId="13770288" wp14:editId="440D033E">
               <wp:simplePos x="0" y="0"/>
               <wp:positionH relativeFrom="page">
-                <wp:posOffset>1628775</wp:posOffset>
+                <wp:posOffset>-3175</wp:posOffset>
               </wp:positionH>
-              <wp:positionV relativeFrom="paragraph">
-                <wp:posOffset>-488315</wp:posOffset>
+              <wp:positionV relativeFrom="page">
+                <wp:posOffset>9729635</wp:posOffset>
               </wp:positionV>
-              <wp:extent cx="7808595" cy="1779270"/>
-              <wp:effectExtent l="0" t="0" r="1905" b="0"/>
+              <wp:extent cx="6610350" cy="198120"/>
+              <wp:effectExtent l="0" t="0" r="0" b="0"/>
               <wp:wrapNone/>
-              <wp:docPr id="6" name="Triangle 6"/>
-              <wp:cNvGraphicFramePr/>
+              <wp:docPr id="1567171009" name="Graphic 1"/>
+              <wp:cNvGraphicFramePr>
+                <a:graphicFrameLocks xmlns:a="http://schemas.openxmlformats.org/drawingml/2006/main"/>
+              </wp:cNvGraphicFramePr>
               <a:graphic xmlns:a="http://schemas.openxmlformats.org/drawingml/2006/main">
                 <a:graphicData uri="http://schemas.microsoft.com/office/word/2010/wordprocessingShape">
                   <wps:wsp>
-                    <wps:cNvSpPr/>
+                    <wps:cNvSpPr>
+                      <a:spLocks/>
+                    </wps:cNvSpPr>
                     <wps:spPr>
                       <a:xfrm>
                         <a:off x="0" y="0"/>
-                        <a:ext cx="7808595" cy="1779270"/>
+                        <a:ext cx="6610350" cy="198120"/>
                       </a:xfrm>
-                      <a:prstGeom prst="triangle">
-                        <a:avLst>
-                          <a:gd name="adj" fmla="val 100000"/>
-                        </a:avLst>
-                      </a:prstGeom>
+                      <a:custGeom>
+                        <a:avLst/>
+                        <a:gdLst/>
+                        <a:ahLst/>
+                        <a:cxnLst/>
+                        <a:rect l="l" t="t" r="r" b="b"/>
+                        <a:pathLst>
+                          <a:path w="6610350" h="198120">
+                            <a:moveTo>
+                              <a:pt x="6610197" y="98894"/>
+                            </a:moveTo>
+                            <a:lnTo>
+                              <a:pt x="2296604" y="98894"/>
+                            </a:lnTo>
+                            <a:lnTo>
+                              <a:pt x="2296604" y="0"/>
+                            </a:lnTo>
+                            <a:lnTo>
+                              <a:pt x="0" y="0"/>
+                            </a:lnTo>
+                            <a:lnTo>
+                              <a:pt x="0" y="98894"/>
+                            </a:lnTo>
+                            <a:lnTo>
+                              <a:pt x="0" y="102171"/>
+                            </a:lnTo>
+                            <a:lnTo>
+                              <a:pt x="0" y="197789"/>
+                            </a:lnTo>
+                            <a:lnTo>
+                              <a:pt x="2296604" y="197789"/>
+                            </a:lnTo>
+                            <a:lnTo>
+                              <a:pt x="2296604" y="102171"/>
+                            </a:lnTo>
+                            <a:lnTo>
+                              <a:pt x="6610197" y="102171"/>
+                            </a:lnTo>
+                            <a:lnTo>
+                              <a:pt x="6610197" y="98894"/>
+                            </a:lnTo>
+                            <a:close/>
+                          </a:path>
+                        </a:pathLst>
+                      </a:custGeom>
                       <a:solidFill>
-                        <a:srgbClr val="003761"/>
+                        <a:srgbClr val="B92027"/>
                       </a:solidFill>
-                      <a:ln>
-                        <a:noFill/>
-                      </a:ln>
                     </wps:spPr>
-                    <wps:style>
-                      <a:lnRef idx="2">
-                        <a:schemeClr val="accent1">
-                          <a:shade val="50000"/>
-                        </a:schemeClr>
-                      </a:lnRef>
-                      <a:fillRef idx="1">
-                        <a:schemeClr val="accent1"/>
-                      </a:fillRef>
-                      <a:effectRef idx="0">
-                        <a:schemeClr val="accent1"/>
-                      </a:effectRef>
-                      <a:fontRef idx="minor">
-                        <a:schemeClr val="lt1"/>
-                      </a:fontRef>
-                    </wps:style>
-                    <wps:bodyPr rot="0" spcFirstLastPara="0" vertOverflow="overflow" horzOverflow="overflow" vert="horz" wrap="square" lIns="91440" tIns="45720" rIns="91440" bIns="45720" numCol="1" spcCol="0" rtlCol="0" fromWordArt="0" anchor="ctr" anchorCtr="0" forceAA="0" compatLnSpc="1">
+                    <wps:bodyPr wrap="square" lIns="0" tIns="0" rIns="0" bIns="0" rtlCol="0">
                       <a:prstTxWarp prst="textNoShape">
                         <a:avLst/>
                       </a:prstTxWarp>
@@ -938,30 +1406,74 @@
         </mc:Choice>
         <mc:Fallback>
           <w:pict>
-            <v:shapetype w14:anchorId="61542F73" id="_x0000_t5" coordsize="21600,21600" o:spt="5" adj="10800" path="m@0,l,21600r21600,xe">
-              <v:stroke joinstyle="miter"/>
-              <v:formulas>
-                <v:f eqn="val #0"/>
-                <v:f eqn="prod #0 1 2"/>
-                <v:f eqn="sum @1 10800 0"/>
-              </v:formulas>
-              <v:path gradientshapeok="t" o:connecttype="custom" o:connectlocs="@0,0;@1,10800;0,21600;10800,21600;21600,21600;@2,10800" textboxrect="0,10800,10800,18000;5400,10800,16200,18000;10800,10800,21600,18000;0,7200,7200,21600;7200,7200,14400,21600;14400,7200,21600,21600"/>
-              <v:handles>
-                <v:h position="#0,topLeft" xrange="0,21600"/>
-              </v:handles>
-            </v:shapetype>
-            <v:shape id="Triangle 6" o:spid="_x0000_s1026" type="#_x0000_t5" style="position:absolute;margin-left:128.25pt;margin-top:-38.45pt;width:614.85pt;height:140.1pt;z-index:-251657216;visibility:visible;mso-wrap-style:square;mso-width-percent:0;mso-height-percent:0;mso-wrap-distance-left:9pt;mso-wrap-distance-top:0;mso-wrap-distance-right:9pt;mso-wrap-distance-bottom:0;mso-position-horizontal:absolute;mso-position-horizontal-relative:page;mso-position-vertical:absolute;mso-position-vertical-relative:text;mso-width-percent:0;mso-height-percent:0;mso-width-relative:margin;mso-height-relative:margin;v-text-anchor:middle" o:gfxdata="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" adj="21600" fillcolor="#003761" stroked="f" strokeweight="1pt">
-              <w10:wrap anchorx="page"/>
+            <v:shape w14:anchorId="4C3A4FD3" id="Graphic 1" o:spid="_x0000_s1026" style="position:absolute;margin-left:-.25pt;margin-top:766.1pt;width:520.5pt;height:15.6pt;z-index:-251646976;visibility:visible;mso-wrap-style:square;mso-width-percent:0;mso-height-percent:0;mso-wrap-distance-left:0;mso-wrap-distance-top:0;mso-wrap-distance-right:0;mso-wrap-distance-bottom:0;mso-position-horizontal:absolute;mso-position-horizontal-relative:page;mso-position-vertical:absolute;mso-position-vertical-relative:page;mso-width-percent:0;mso-height-percent:0;mso-width-relative:margin;mso-height-relative:margin;v-text-anchor:top" coordsize="6610350,198120" o:gfxdata="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" path="m6610197,98894r-4313593,l2296604,,,,,98894r,3277l,197789r2296604,l2296604,102171r4313593,l6610197,98894xe" fillcolor="#b92027" stroked="f">
+              <v:path arrowok="t"/>
+              <w10:wrap anchorx="page" anchory="page"/>
             </v:shape>
           </w:pict>
         </mc:Fallback>
       </mc:AlternateContent>
     </w:r>
+    <w:r>
+      <w:rPr>
+        <w:noProof/>
+        <w:sz w:val="20"/>
+      </w:rPr>
+      <w:drawing>
+        <wp:anchor distT="0" distB="0" distL="0" distR="0" simplePos="0" relativeHeight="251671552" behindDoc="1" locked="0" layoutInCell="1" allowOverlap="1" wp14:anchorId="01D9BA39" wp14:editId="319E9D16">
+          <wp:simplePos x="0" y="0"/>
+          <wp:positionH relativeFrom="page">
+            <wp:posOffset>397510</wp:posOffset>
+          </wp:positionH>
+          <wp:positionV relativeFrom="page">
+            <wp:posOffset>10132005</wp:posOffset>
+          </wp:positionV>
+          <wp:extent cx="252768" cy="252780"/>
+          <wp:effectExtent l="0" t="0" r="0" b="0"/>
+          <wp:wrapNone/>
+          <wp:docPr id="1349149289" name="Image 8" descr="A white house in a red circle&#10;&#10;AI-generated content may be incorrect."/>
+          <wp:cNvGraphicFramePr>
+            <a:graphicFrameLocks xmlns:a="http://schemas.openxmlformats.org/drawingml/2006/main"/>
+          </wp:cNvGraphicFramePr>
+          <a:graphic xmlns:a="http://schemas.openxmlformats.org/drawingml/2006/main">
+            <a:graphicData uri="http://schemas.openxmlformats.org/drawingml/2006/picture">
+              <pic:pic xmlns:pic="http://schemas.openxmlformats.org/drawingml/2006/picture">
+                <pic:nvPicPr>
+                  <pic:cNvPr id="205844507" name="Image 8" descr="A white house in a red circle&#10;&#10;AI-generated content may be incorrect."/>
+                  <pic:cNvPicPr/>
+                </pic:nvPicPr>
+                <pic:blipFill>
+                  <a:blip r:embed="rId2" cstate="print"/>
+                  <a:stretch>
+                    <a:fillRect/>
+                  </a:stretch>
+                </pic:blipFill>
+                <pic:spPr>
+                  <a:xfrm>
+                    <a:off x="0" y="0"/>
+                    <a:ext cx="252768" cy="252780"/>
+                  </a:xfrm>
+                  <a:prstGeom prst="rect">
+                    <a:avLst/>
+                  </a:prstGeom>
+                </pic:spPr>
+              </pic:pic>
+            </a:graphicData>
+          </a:graphic>
+          <wp14:sizeRelH relativeFrom="margin">
+            <wp14:pctWidth>0</wp14:pctWidth>
+          </wp14:sizeRelH>
+          <wp14:sizeRelV relativeFrom="margin">
+            <wp14:pctHeight>0</wp14:pctHeight>
+          </wp14:sizeRelV>
+        </wp:anchor>
+      </w:drawing>
+    </w:r>
   </w:p>
   <w:tbl>
     <w:tblPr>
       <w:tblStyle w:val="TableGrid"/>
-      <w:tblW w:w="15882" w:type="dxa"/>
+      <w:tblW w:w="10477" w:type="dxa"/>
       <w:tblBorders>
         <w:top w:val="none" w:sz="0" w:space="0" w:color="auto"/>
         <w:left w:val="none" w:sz="0" w:space="0" w:color="auto"/>
@@ -970,193 +1482,834 @@
         <w:insideH w:val="none" w:sz="0" w:space="0" w:color="auto"/>
         <w:insideV w:val="none" w:sz="0" w:space="0" w:color="auto"/>
       </w:tblBorders>
-      <w:tblCellMar>
-        <w:left w:w="0" w:type="dxa"/>
-        <w:right w:w="0" w:type="dxa"/>
-      </w:tblCellMar>
       <w:tblLook w:val="04A0" w:firstRow="1" w:lastRow="0" w:firstColumn="1" w:lastColumn="0" w:noHBand="0" w:noVBand="1"/>
     </w:tblPr>
     <w:tblGrid>
-      <w:gridCol w:w="7941"/>
-      <w:gridCol w:w="7941"/>
+      <w:gridCol w:w="3361"/>
+      <w:gridCol w:w="3361"/>
+      <w:gridCol w:w="2855"/>
+      <w:gridCol w:w="900"/>
     </w:tblGrid>
     <w:tr>
       <w:trPr>
-        <w:trHeight w:val="840"/>
+        <w:trHeight w:val="825"/>
       </w:trPr>
       <w:tc>
         <w:tcPr>
-          <w:tcW w:w="7941" w:type="dxa"/>
-          <w:vAlign w:val="bottom"/>
+          <w:tcW w:w="3361" w:type="dxa"/>
+          <w:vAlign w:val="center"/>
         </w:tcPr>
         <w:p>
           <w:pPr>
             <w:pStyle w:val="Footer"/>
-            <w:rPr>
-              <w:rFonts w:ascii="Helvetica" w:hAnsi="Helvetica"/>
-              <w:b/>
-              <w:bCs/>
-              <w:color w:val="FFFFFF" w:themeColor="background1"/>
-              <w:sz w:val="22"/>
-              <w:szCs w:val="22"/>
-            </w:rPr>
+            <w:tabs>
+              <w:tab w:val="left" w:pos="540"/>
+              <w:tab w:val="left" w:pos="810"/>
+              <w:tab w:val="left" w:pos="8280"/>
+            </w:tabs>
           </w:pPr>
           <w:r>
             <w:rPr>
-              <w:rFonts w:ascii="Helvetica" w:hAnsi="Helvetica"/>
-              <w:b/>
-              <w:bCs/>
-              <w:color w:val="FFFFFF" w:themeColor="background1"/>
+              <w:noProof/>
+              <w:sz w:val="20"/>
             </w:rPr>
-            <w:t>www.gss-group.net</w:t>
-          </w:r>
-        </w:p>
-        <w:p>
-          <w:pPr>
-            <w:pStyle w:val="Footer"/>
-            <w:rPr>
-              <w:rFonts w:ascii="Helvetica" w:hAnsi="Helvetica"/>
-              <w:color w:val="FFFFFF" w:themeColor="background1"/>
-              <w:sz w:val="18"/>
-              <w:szCs w:val="18"/>
-            </w:rPr>
-          </w:pPr>
-          <w:r>
-            <w:rPr>
-              <w:rFonts w:ascii="Helvetica" w:hAnsi="Helvetica"/>
-              <w:color w:val="FFFFFF" w:themeColor="background1"/>
-              <w:sz w:val="18"/>
-              <w:szCs w:val="18"/>
-            </w:rPr>
-            <w:t>{{ submitter_g }}</w:t>
+            <mc:AlternateContent>
+              <mc:Choice Requires="wps">
+                <w:drawing>
+                  <wp:anchor distT="0" distB="0" distL="0" distR="0" simplePos="0" relativeHeight="251672576" behindDoc="1" locked="0" layoutInCell="1" allowOverlap="1" wp14:anchorId="11588BD9" wp14:editId="49AC23D2">
+                    <wp:simplePos x="0" y="0"/>
+                    <wp:positionH relativeFrom="page">
+                      <wp:posOffset>463550</wp:posOffset>
+                    </wp:positionH>
+                    <wp:positionV relativeFrom="page">
+                      <wp:posOffset>506095</wp:posOffset>
+                    </wp:positionV>
+                    <wp:extent cx="1467485" cy="131445"/>
+                    <wp:effectExtent l="0" t="0" r="0" b="0"/>
+                    <wp:wrapNone/>
+                    <wp:docPr id="677797860" name="Textbox 13"/>
+                    <wp:cNvGraphicFramePr>
+                      <a:graphicFrameLocks xmlns:a="http://schemas.openxmlformats.org/drawingml/2006/main"/>
+                    </wp:cNvGraphicFramePr>
+                    <a:graphic xmlns:a="http://schemas.openxmlformats.org/drawingml/2006/main">
+                      <a:graphicData uri="http://schemas.microsoft.com/office/word/2010/wordprocessingShape">
+                        <wps:wsp>
+                          <wps:cNvSpPr txBox="1">
+                            <a:spLocks/>
+                          </wps:cNvSpPr>
+                          <wps:spPr>
+                            <a:xfrm>
+                              <a:off x="0" y="0"/>
+                              <a:ext cx="1467485" cy="131445"/>
+                            </a:xfrm>
+                            <a:prstGeom prst="rect">
+                              <a:avLst/>
+                            </a:prstGeom>
+                          </wps:spPr>
+                          <wps:txbx>
+                            <w:txbxContent>
+                              <w:p>
+                                <w:pPr>
+                                  <w:spacing w:line="184" w:lineRule="exact"/>
+                                  <w:ind w:left="20"/>
+                                  <w:rPr>
+                                    <w:sz w:val="16"/>
+                                  </w:rPr>
+                                </w:pPr>
+                                <w:r>
+                                  <w:rPr>
+                                    <w:color w:val="A09F9F"/>
+                                    <w:spacing w:val="-6"/>
+                                    <w:sz w:val="16"/>
+                                  </w:rPr>
+                                  <w:t>Abu Dhabi,</w:t>
+                                </w:r>
+                                <w:r>
+                                  <w:rPr>
+                                    <w:color w:val="A09F9F"/>
+                                    <w:spacing w:val="-10"/>
+                                    <w:sz w:val="16"/>
+                                  </w:rPr>
+                                  <w:t xml:space="preserve"> </w:t>
+                                </w:r>
+                                <w:r>
+                                  <w:rPr>
+                                    <w:color w:val="A09F9F"/>
+                                    <w:spacing w:val="-6"/>
+                                    <w:sz w:val="16"/>
+                                  </w:rPr>
+                                  <w:t>United</w:t>
+                                </w:r>
+                                <w:r>
+                                  <w:rPr>
+                                    <w:color w:val="A09F9F"/>
+                                    <w:spacing w:val="-9"/>
+                                    <w:sz w:val="16"/>
+                                  </w:rPr>
+                                  <w:t xml:space="preserve"> </w:t>
+                                </w:r>
+                                <w:r>
+                                  <w:rPr>
+                                    <w:color w:val="A09F9F"/>
+                                    <w:spacing w:val="-6"/>
+                                    <w:sz w:val="16"/>
+                                  </w:rPr>
+                                  <w:t>Arab</w:t>
+                                </w:r>
+                                <w:r>
+                                  <w:rPr>
+                                    <w:color w:val="A09F9F"/>
+                                    <w:spacing w:val="-10"/>
+                                    <w:sz w:val="16"/>
+                                  </w:rPr>
+                                  <w:t xml:space="preserve"> </w:t>
+                                </w:r>
+                                <w:r>
+                                  <w:rPr>
+                                    <w:color w:val="A09F9F"/>
+                                    <w:spacing w:val="-6"/>
+                                    <w:sz w:val="16"/>
+                                  </w:rPr>
+                                  <w:t>Emirates</w:t>
+                                </w:r>
+                              </w:p>
+                            </w:txbxContent>
+                          </wps:txbx>
+                          <wps:bodyPr wrap="square" lIns="0" tIns="0" rIns="0" bIns="0" rtlCol="0">
+                            <a:noAutofit/>
+                          </wps:bodyPr>
+                        </wps:wsp>
+                      </a:graphicData>
+                    </a:graphic>
+                    <wp14:sizeRelH relativeFrom="margin">
+                      <wp14:pctWidth>0</wp14:pctWidth>
+                    </wp14:sizeRelH>
+                    <wp14:sizeRelV relativeFrom="margin">
+                      <wp14:pctHeight>0</wp14:pctHeight>
+                    </wp14:sizeRelV>
+                  </wp:anchor>
+                </w:drawing>
+              </mc:Choice>
+              <mc:Fallback>
+                <w:pict>
+                  <v:shapetype w14:anchorId="11588BD9" id="_x0000_t202" coordsize="21600,21600" o:spt="202" path="m,l,21600r21600,l21600,xe">
+                    <v:stroke joinstyle="miter"/>
+                    <v:path gradientshapeok="t" o:connecttype="rect"/>
+                  </v:shapetype>
+                  <v:shape id="Textbox 13" o:spid="_x0000_s1026" type="#_x0000_t202" style="position:absolute;margin-left:36.5pt;margin-top:39.85pt;width:115.55pt;height:10.35pt;z-index:-251643904;visibility:visible;mso-wrap-style:square;mso-width-percent:0;mso-height-percent:0;mso-wrap-distance-left:0;mso-wrap-distance-top:0;mso-wrap-distance-right:0;mso-wrap-distance-bottom:0;mso-position-horizontal:absolute;mso-position-horizontal-relative:page;mso-position-vertical:absolute;mso-position-vertical-relative:page;mso-width-percent:0;mso-height-percent:0;mso-width-relative:margin;mso-height-relative:margin;v-text-anchor:top" o:gfxdata="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" filled="f" stroked="f">
+                    <v:textbox inset="0,0,0,0">
+                      <w:txbxContent>
+                        <w:p>
+                          <w:pPr>
+                            <w:spacing w:line="184" w:lineRule="exact"/>
+                            <w:ind w:left="20"/>
+                            <w:rPr>
+                              <w:sz w:val="16"/>
+                            </w:rPr>
+                          </w:pPr>
+                          <w:r>
+                            <w:rPr>
+                              <w:color w:val="A09F9F"/>
+                              <w:spacing w:val="-6"/>
+                              <w:sz w:val="16"/>
+                            </w:rPr>
+                            <w:t>Abu Dhabi,</w:t>
+                          </w:r>
+                          <w:r>
+                            <w:rPr>
+                              <w:color w:val="A09F9F"/>
+                              <w:spacing w:val="-10"/>
+                              <w:sz w:val="16"/>
+                            </w:rPr>
+                            <w:t xml:space="preserve"> </w:t>
+                          </w:r>
+                          <w:r>
+                            <w:rPr>
+                              <w:color w:val="A09F9F"/>
+                              <w:spacing w:val="-6"/>
+                              <w:sz w:val="16"/>
+                            </w:rPr>
+                            <w:t>United</w:t>
+                          </w:r>
+                          <w:r>
+                            <w:rPr>
+                              <w:color w:val="A09F9F"/>
+                              <w:spacing w:val="-9"/>
+                              <w:sz w:val="16"/>
+                            </w:rPr>
+                            <w:t xml:space="preserve"> </w:t>
+                          </w:r>
+                          <w:r>
+                            <w:rPr>
+                              <w:color w:val="A09F9F"/>
+                              <w:spacing w:val="-6"/>
+                              <w:sz w:val="16"/>
+                            </w:rPr>
+                            <w:t>Arab</w:t>
+                          </w:r>
+                          <w:r>
+                            <w:rPr>
+                              <w:color w:val="A09F9F"/>
+                              <w:spacing w:val="-10"/>
+                              <w:sz w:val="16"/>
+                            </w:rPr>
+                            <w:t xml:space="preserve"> </w:t>
+                          </w:r>
+                          <w:r>
+                            <w:rPr>
+                              <w:color w:val="A09F9F"/>
+                              <w:spacing w:val="-6"/>
+                              <w:sz w:val="16"/>
+                            </w:rPr>
+                            <w:t>Emirates</w:t>
+                          </w:r>
+                        </w:p>
+                      </w:txbxContent>
+                    </v:textbox>
+                    <w10:wrap anchorx="page" anchory="page"/>
+                  </v:shape>
+                </w:pict>
+              </mc:Fallback>
+            </mc:AlternateContent>
           </w:r>
         </w:p>
       </w:tc>
       <w:tc>
         <w:tcPr>
-          <w:tcW w:w="7941" w:type="dxa"/>
-          <w:vAlign w:val="bottom"/>
+          <w:tcW w:w="3361" w:type="dxa"/>
+          <w:vAlign w:val="center"/>
         </w:tcPr>
         <w:p>
           <w:pPr>
-            <w:jc w:val="right"/>
-            <w:rPr>
-              <w:rFonts w:ascii="Helvetica" w:hAnsi="Helvetica" w:cs="Open Sans"/>
-              <w:b/>
-              <w:bCs/>
-              <w:color w:val="FFFFFF" w:themeColor="background1"/>
-              <w:sz w:val="18"/>
-              <w:szCs w:val="18"/>
-            </w:rPr>
+            <w:pStyle w:val="Footer"/>
+            <w:tabs>
+              <w:tab w:val="left" w:pos="540"/>
+              <w:tab w:val="left" w:pos="810"/>
+              <w:tab w:val="left" w:pos="8280"/>
+            </w:tabs>
           </w:pPr>
           <w:r>
             <w:rPr>
-              <w:rFonts w:ascii="Helvetica" w:hAnsi="Helvetica" w:cs="Open Sans"/>
-              <w:b/>
-              <w:bCs/>
-              <w:color w:val="FFFFFF" w:themeColor="background1"/>
-              <w:sz w:val="18"/>
-              <w:szCs w:val="18"/>
+              <w:noProof/>
+              <w:sz w:val="20"/>
             </w:rPr>
-            <w:t xml:space="preserve">Physical Address:                             </w:t>
+            <w:drawing>
+              <wp:anchor distT="0" distB="0" distL="0" distR="0" simplePos="0" relativeHeight="251673600" behindDoc="1" locked="0" layoutInCell="1" allowOverlap="1" wp14:anchorId="6208AE3C" wp14:editId="6FD264E0">
+                <wp:simplePos x="0" y="0"/>
+                <wp:positionH relativeFrom="page">
+                  <wp:posOffset>264160</wp:posOffset>
+                </wp:positionH>
+                <wp:positionV relativeFrom="page">
+                  <wp:posOffset>436880</wp:posOffset>
+                </wp:positionV>
+                <wp:extent cx="252730" cy="252730"/>
+                <wp:effectExtent l="0" t="0" r="0" b="0"/>
+                <wp:wrapNone/>
+                <wp:docPr id="1488181570" name="Image 9" descr="A red and black logo&#10;&#10;AI-generated content may be incorrect."/>
+                <wp:cNvGraphicFramePr>
+                  <a:graphicFrameLocks xmlns:a="http://schemas.openxmlformats.org/drawingml/2006/main"/>
+                </wp:cNvGraphicFramePr>
+                <a:graphic xmlns:a="http://schemas.openxmlformats.org/drawingml/2006/main">
+                  <a:graphicData uri="http://schemas.openxmlformats.org/drawingml/2006/picture">
+                    <pic:pic xmlns:pic="http://schemas.openxmlformats.org/drawingml/2006/picture">
+                      <pic:nvPicPr>
+                        <pic:cNvPr id="739794193" name="Image 9" descr="A red and black logo&#10;&#10;AI-generated content may be incorrect."/>
+                        <pic:cNvPicPr/>
+                      </pic:nvPicPr>
+                      <pic:blipFill>
+                        <a:blip r:embed="rId3" cstate="print"/>
+                        <a:stretch>
+                          <a:fillRect/>
+                        </a:stretch>
+                      </pic:blipFill>
+                      <pic:spPr>
+                        <a:xfrm>
+                          <a:off x="0" y="0"/>
+                          <a:ext cx="252730" cy="252730"/>
+                        </a:xfrm>
+                        <a:prstGeom prst="rect">
+                          <a:avLst/>
+                        </a:prstGeom>
+                      </pic:spPr>
+                    </pic:pic>
+                  </a:graphicData>
+                </a:graphic>
+                <wp14:sizeRelH relativeFrom="margin">
+                  <wp14:pctWidth>0</wp14:pctWidth>
+                </wp14:sizeRelH>
+                <wp14:sizeRelV relativeFrom="margin">
+                  <wp14:pctHeight>0</wp14:pctHeight>
+                </wp14:sizeRelV>
+              </wp:anchor>
+            </w:drawing>
+          </w:r>
+          <w:r>
+            <w:rPr>
+              <w:noProof/>
+              <w:sz w:val="20"/>
+            </w:rPr>
+            <mc:AlternateContent>
+              <mc:Choice Requires="wps">
+                <w:drawing>
+                  <wp:anchor distT="0" distB="0" distL="0" distR="0" simplePos="0" relativeHeight="251674624" behindDoc="1" locked="0" layoutInCell="1" allowOverlap="1" wp14:anchorId="6356371C" wp14:editId="29B1541C">
+                    <wp:simplePos x="0" y="0"/>
+                    <wp:positionH relativeFrom="page">
+                      <wp:posOffset>749935</wp:posOffset>
+                    </wp:positionH>
+                    <wp:positionV relativeFrom="page">
+                      <wp:posOffset>425450</wp:posOffset>
+                    </wp:positionV>
+                    <wp:extent cx="1002030" cy="280670"/>
+                    <wp:effectExtent l="0" t="0" r="0" b="0"/>
+                    <wp:wrapNone/>
+                    <wp:docPr id="1162565882" name="Textbox 11"/>
+                    <wp:cNvGraphicFramePr>
+                      <a:graphicFrameLocks xmlns:a="http://schemas.openxmlformats.org/drawingml/2006/main"/>
+                    </wp:cNvGraphicFramePr>
+                    <a:graphic xmlns:a="http://schemas.openxmlformats.org/drawingml/2006/main">
+                      <a:graphicData uri="http://schemas.microsoft.com/office/word/2010/wordprocessingShape">
+                        <wps:wsp>
+                          <wps:cNvSpPr txBox="1">
+                            <a:spLocks/>
+                          </wps:cNvSpPr>
+                          <wps:spPr>
+                            <a:xfrm>
+                              <a:off x="0" y="0"/>
+                              <a:ext cx="1002030" cy="280670"/>
+                            </a:xfrm>
+                            <a:prstGeom prst="rect">
+                              <a:avLst/>
+                            </a:prstGeom>
+                          </wps:spPr>
+                          <wps:txbx>
+                            <w:txbxContent>
+                              <w:p>
+                                <w:pPr>
+                                  <w:pStyle w:val="BodyText"/>
+                                  <w:spacing w:line="183" w:lineRule="exact"/>
+                                  <w:ind w:left="20"/>
+                                </w:pPr>
+                                <w:hyperlink r:id="rId4">
+                                  <w:r>
+                                    <w:rPr>
+                                      <w:color w:val="A09F9F"/>
+                                      <w:spacing w:val="-11"/>
+                                    </w:rPr>
+                                    <w:t>info@gss-</w:t>
+                                  </w:r>
+                                  <w:r>
+                                    <w:rPr>
+                                      <w:color w:val="A09F9F"/>
+                                      <w:spacing w:val="-6"/>
+                                    </w:rPr>
+                                    <w:t>group.net</w:t>
+                                  </w:r>
+                                </w:hyperlink>
+                              </w:p>
+                              <w:p>
+                                <w:pPr>
+                                  <w:pStyle w:val="BodyText"/>
+                                  <w:spacing w:line="236" w:lineRule="exact"/>
+                                  <w:ind w:left="36"/>
+                                </w:pPr>
+                                <w:hyperlink r:id="rId5">
+                                  <w:r>
+                                    <w:rPr>
+                                      <w:color w:val="A09F9F"/>
+                                      <w:spacing w:val="-9"/>
+                                    </w:rPr>
+                                    <w:t>www.gss-</w:t>
+                                  </w:r>
+                                  <w:r>
+                                    <w:rPr>
+                                      <w:color w:val="A09F9F"/>
+                                      <w:spacing w:val="-5"/>
+                                    </w:rPr>
+                                    <w:t>group.net</w:t>
+                                  </w:r>
+                                </w:hyperlink>
+                              </w:p>
+                            </w:txbxContent>
+                          </wps:txbx>
+                          <wps:bodyPr wrap="square" lIns="0" tIns="0" rIns="0" bIns="0" rtlCol="0">
+                            <a:noAutofit/>
+                          </wps:bodyPr>
+                        </wps:wsp>
+                      </a:graphicData>
+                    </a:graphic>
+                    <wp14:sizeRelH relativeFrom="margin">
+                      <wp14:pctWidth>0</wp14:pctWidth>
+                    </wp14:sizeRelH>
+                    <wp14:sizeRelV relativeFrom="margin">
+                      <wp14:pctHeight>0</wp14:pctHeight>
+                    </wp14:sizeRelV>
+                  </wp:anchor>
+                </w:drawing>
+              </mc:Choice>
+              <mc:Fallback>
+                <w:pict>
+                  <v:shape w14:anchorId="6356371C" id="Textbox 11" o:spid="_x0000_s1027" type="#_x0000_t202" style="position:absolute;margin-left:59.05pt;margin-top:33.5pt;width:78.9pt;height:22.1pt;z-index:-251641856;visibility:visible;mso-wrap-style:square;mso-width-percent:0;mso-height-percent:0;mso-wrap-distance-left:0;mso-wrap-distance-top:0;mso-wrap-distance-right:0;mso-wrap-distance-bottom:0;mso-position-horizontal:absolute;mso-position-horizontal-relative:page;mso-position-vertical:absolute;mso-position-vertical-relative:page;mso-width-percent:0;mso-height-percent:0;mso-width-relative:margin;mso-height-relative:margin;v-text-anchor:top" o:gfxdata="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" filled="f" stroked="f">
+                    <v:textbox inset="0,0,0,0">
+                      <w:txbxContent>
+                        <w:p>
+                          <w:pPr>
+                            <w:pStyle w:val="BodyText"/>
+                            <w:spacing w:line="183" w:lineRule="exact"/>
+                            <w:ind w:left="20"/>
+                          </w:pPr>
+                          <w:hyperlink r:id="rId6">
+                            <w:r>
+                              <w:rPr>
+                                <w:color w:val="A09F9F"/>
+                                <w:spacing w:val="-11"/>
+                              </w:rPr>
+                              <w:t>info@gss-</w:t>
+                            </w:r>
+                            <w:r>
+                              <w:rPr>
+                                <w:color w:val="A09F9F"/>
+                                <w:spacing w:val="-6"/>
+                              </w:rPr>
+                              <w:t>group.net</w:t>
+                            </w:r>
+                          </w:hyperlink>
+                        </w:p>
+                        <w:p>
+                          <w:pPr>
+                            <w:pStyle w:val="BodyText"/>
+                            <w:spacing w:line="236" w:lineRule="exact"/>
+                            <w:ind w:left="36"/>
+                          </w:pPr>
+                          <w:hyperlink r:id="rId7">
+                            <w:r>
+                              <w:rPr>
+                                <w:color w:val="A09F9F"/>
+                                <w:spacing w:val="-9"/>
+                              </w:rPr>
+                              <w:t>www.gss-</w:t>
+                            </w:r>
+                            <w:r>
+                              <w:rPr>
+                                <w:color w:val="A09F9F"/>
+                                <w:spacing w:val="-5"/>
+                              </w:rPr>
+                              <w:t>group.net</w:t>
+                            </w:r>
+                          </w:hyperlink>
+                        </w:p>
+                      </w:txbxContent>
+                    </v:textbox>
+                    <w10:wrap anchorx="page" anchory="page"/>
+                  </v:shape>
+                </w:pict>
+              </mc:Fallback>
+            </mc:AlternateContent>
           </w:r>
         </w:p>
+      </w:tc>
+      <w:tc>
+        <w:tcPr>
+          <w:tcW w:w="2855" w:type="dxa"/>
+          <w:vAlign w:val="center"/>
+        </w:tcPr>
         <w:p>
           <w:pPr>
-            <w:jc w:val="right"/>
-            <w:rPr>
-              <w:rFonts w:ascii="Helvetica" w:hAnsi="Helvetica" w:cs="Open Sans"/>
-              <w:color w:val="FFFFFF" w:themeColor="background1"/>
-              <w:sz w:val="18"/>
-              <w:szCs w:val="18"/>
-            </w:rPr>
+            <w:pStyle w:val="Footer"/>
+            <w:tabs>
+              <w:tab w:val="left" w:pos="540"/>
+              <w:tab w:val="left" w:pos="810"/>
+              <w:tab w:val="left" w:pos="8280"/>
+            </w:tabs>
           </w:pPr>
           <w:r>
             <w:rPr>
-              <w:rFonts w:ascii="Helvetica" w:hAnsi="Helvetica" w:cs="Open Sans"/>
-              <w:color w:val="FFFFFF" w:themeColor="background1"/>
-              <w:sz w:val="18"/>
-              <w:szCs w:val="18"/>
+              <w:noProof/>
+              <w:sz w:val="20"/>
             </w:rPr>
-            <w:t xml:space="preserve">Building No 3, 3rd Floor                      </w:t>
+            <mc:AlternateContent>
+              <mc:Choice Requires="wps">
+                <w:drawing>
+                  <wp:anchor distT="0" distB="0" distL="0" distR="0" simplePos="0" relativeHeight="251676672" behindDoc="1" locked="0" layoutInCell="1" allowOverlap="1" wp14:anchorId="65CCB6A6" wp14:editId="5B3B5E3A">
+                    <wp:simplePos x="0" y="0"/>
+                    <wp:positionH relativeFrom="page">
+                      <wp:posOffset>671830</wp:posOffset>
+                    </wp:positionH>
+                    <wp:positionV relativeFrom="page">
+                      <wp:posOffset>431165</wp:posOffset>
+                    </wp:positionV>
+                    <wp:extent cx="1095375" cy="281940"/>
+                    <wp:effectExtent l="0" t="0" r="0" b="0"/>
+                    <wp:wrapNone/>
+                    <wp:docPr id="125634665" name="Textbox 12"/>
+                    <wp:cNvGraphicFramePr>
+                      <a:graphicFrameLocks xmlns:a="http://schemas.openxmlformats.org/drawingml/2006/main"/>
+                    </wp:cNvGraphicFramePr>
+                    <a:graphic xmlns:a="http://schemas.openxmlformats.org/drawingml/2006/main">
+                      <a:graphicData uri="http://schemas.microsoft.com/office/word/2010/wordprocessingShape">
+                        <wps:wsp>
+                          <wps:cNvSpPr txBox="1">
+                            <a:spLocks/>
+                          </wps:cNvSpPr>
+                          <wps:spPr>
+                            <a:xfrm>
+                              <a:off x="0" y="0"/>
+                              <a:ext cx="1095375" cy="281940"/>
+                            </a:xfrm>
+                            <a:prstGeom prst="rect">
+                              <a:avLst/>
+                            </a:prstGeom>
+                          </wps:spPr>
+                          <wps:txbx>
+                            <w:txbxContent>
+                              <w:p>
+                                <w:pPr>
+                                  <w:pStyle w:val="BodyText"/>
+                                  <w:spacing w:line="200" w:lineRule="exact"/>
+                                  <w:ind w:left="20"/>
+                                </w:pPr>
+                                <w:r>
+                                  <w:rPr>
+                                    <w:color w:val="A09F9F"/>
+                                    <w:spacing w:val="-8"/>
+                                  </w:rPr>
+                                  <w:t>Phone:</w:t>
+                                </w:r>
+                                <w:r>
+                                  <w:rPr>
+                                    <w:color w:val="A09F9F"/>
+                                    <w:spacing w:val="-14"/>
+                                  </w:rPr>
+                                  <w:t xml:space="preserve"> </w:t>
+                                </w:r>
+                                <w:r>
+                                  <w:rPr>
+                                    <w:color w:val="A09F9F"/>
+                                    <w:spacing w:val="-8"/>
+                                  </w:rPr>
+                                  <w:t>+9712</w:t>
+                                </w:r>
+                                <w:r>
+                                  <w:rPr>
+                                    <w:color w:val="A09F9F"/>
+                                    <w:spacing w:val="-14"/>
+                                  </w:rPr>
+                                  <w:t xml:space="preserve"> </w:t>
+                                </w:r>
+                                <w:r>
+                                  <w:rPr>
+                                    <w:color w:val="A09F9F"/>
+                                    <w:spacing w:val="-8"/>
+                                  </w:rPr>
+                                  <w:t>6666898</w:t>
+                                </w:r>
+                              </w:p>
+                              <w:p>
+                                <w:pPr>
+                                  <w:spacing w:line="219" w:lineRule="exact"/>
+                                  <w:ind w:left="20"/>
+                                  <w:rPr>
+                                    <w:rFonts w:ascii="Gill Sans MT"/>
+                                    <w:sz w:val="19"/>
+                                  </w:rPr>
+                                </w:pPr>
+                                <w:r>
+                                  <w:rPr>
+                                    <w:rFonts w:ascii="Gill Sans MT"/>
+                                    <w:color w:val="A09F9F"/>
+                                    <w:sz w:val="19"/>
+                                  </w:rPr>
+                                  <w:t>Fax:</w:t>
+                                </w:r>
+                                <w:r>
+                                  <w:rPr>
+                                    <w:rFonts w:ascii="Gill Sans MT"/>
+                                    <w:color w:val="A09F9F"/>
+                                    <w:spacing w:val="-6"/>
+                                    <w:sz w:val="19"/>
+                                  </w:rPr>
+                                  <w:t xml:space="preserve"> </w:t>
+                                </w:r>
+                                <w:r>
+                                  <w:rPr>
+                                    <w:rFonts w:ascii="Gill Sans MT"/>
+                                    <w:color w:val="A09F9F"/>
+                                    <w:sz w:val="19"/>
+                                  </w:rPr>
+                                  <w:t>+971</w:t>
+                                </w:r>
+                                <w:r>
+                                  <w:rPr>
+                                    <w:rFonts w:ascii="Gill Sans MT"/>
+                                    <w:color w:val="A09F9F"/>
+                                    <w:spacing w:val="-6"/>
+                                    <w:sz w:val="19"/>
+                                  </w:rPr>
+                                  <w:t xml:space="preserve"> </w:t>
+                                </w:r>
+                                <w:r>
+                                  <w:rPr>
+                                    <w:rFonts w:ascii="Gill Sans MT"/>
+                                    <w:color w:val="A09F9F"/>
+                                    <w:sz w:val="19"/>
+                                  </w:rPr>
+                                  <w:t>2</w:t>
+                                </w:r>
+                                <w:r>
+                                  <w:rPr>
+                                    <w:rFonts w:ascii="Gill Sans MT"/>
+                                    <w:color w:val="A09F9F"/>
+                                    <w:spacing w:val="-6"/>
+                                    <w:sz w:val="19"/>
+                                  </w:rPr>
+                                  <w:t xml:space="preserve"> </w:t>
+                                </w:r>
+                                <w:r>
+                                  <w:rPr>
+                                    <w:rFonts w:ascii="Gill Sans MT"/>
+                                    <w:color w:val="A09F9F"/>
+                                    <w:sz w:val="19"/>
+                                  </w:rPr>
+                                  <w:t>666</w:t>
+                                </w:r>
+                                <w:r>
+                                  <w:rPr>
+                                    <w:rFonts w:ascii="Gill Sans MT"/>
+                                    <w:color w:val="A09F9F"/>
+                                    <w:spacing w:val="-6"/>
+                                    <w:sz w:val="19"/>
+                                  </w:rPr>
+                                  <w:t xml:space="preserve"> </w:t>
+                                </w:r>
+                                <w:r>
+                                  <w:rPr>
+                                    <w:rFonts w:ascii="Gill Sans MT"/>
+                                    <w:color w:val="A09F9F"/>
+                                    <w:spacing w:val="-4"/>
+                                    <w:sz w:val="19"/>
+                                  </w:rPr>
+                                  <w:t>8980</w:t>
+                                </w:r>
+                              </w:p>
+                            </w:txbxContent>
+                          </wps:txbx>
+                          <wps:bodyPr wrap="square" lIns="0" tIns="0" rIns="0" bIns="0" rtlCol="0">
+                            <a:noAutofit/>
+                          </wps:bodyPr>
+                        </wps:wsp>
+                      </a:graphicData>
+                    </a:graphic>
+                    <wp14:sizeRelH relativeFrom="margin">
+                      <wp14:pctWidth>0</wp14:pctWidth>
+                    </wp14:sizeRelH>
+                    <wp14:sizeRelV relativeFrom="margin">
+                      <wp14:pctHeight>0</wp14:pctHeight>
+                    </wp14:sizeRelV>
+                  </wp:anchor>
+                </w:drawing>
+              </mc:Choice>
+              <mc:Fallback>
+                <w:pict>
+                  <v:shape w14:anchorId="65CCB6A6" id="Textbox 12" o:spid="_x0000_s1028" type="#_x0000_t202" style="position:absolute;margin-left:52.9pt;margin-top:33.95pt;width:86.25pt;height:22.2pt;z-index:-251639808;visibility:visible;mso-wrap-style:square;mso-width-percent:0;mso-height-percent:0;mso-wrap-distance-left:0;mso-wrap-distance-top:0;mso-wrap-distance-right:0;mso-wrap-distance-bottom:0;mso-position-horizontal:absolute;mso-position-horizontal-relative:page;mso-position-vertical:absolute;mso-position-vertical-relative:page;mso-width-percent:0;mso-height-percent:0;mso-width-relative:margin;mso-height-relative:margin;v-text-anchor:top" o:gfxdata="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" filled="f" stroked="f">
+                    <v:textbox inset="0,0,0,0">
+                      <w:txbxContent>
+                        <w:p>
+                          <w:pPr>
+                            <w:pStyle w:val="BodyText"/>
+                            <w:spacing w:line="200" w:lineRule="exact"/>
+                            <w:ind w:left="20"/>
+                          </w:pPr>
+                          <w:r>
+                            <w:rPr>
+                              <w:color w:val="A09F9F"/>
+                              <w:spacing w:val="-8"/>
+                            </w:rPr>
+                            <w:t>Phone:</w:t>
+                          </w:r>
+                          <w:r>
+                            <w:rPr>
+                              <w:color w:val="A09F9F"/>
+                              <w:spacing w:val="-14"/>
+                            </w:rPr>
+                            <w:t xml:space="preserve"> </w:t>
+                          </w:r>
+                          <w:r>
+                            <w:rPr>
+                              <w:color w:val="A09F9F"/>
+                              <w:spacing w:val="-8"/>
+                            </w:rPr>
+                            <w:t>+9712</w:t>
+                          </w:r>
+                          <w:r>
+                            <w:rPr>
+                              <w:color w:val="A09F9F"/>
+                              <w:spacing w:val="-14"/>
+                            </w:rPr>
+                            <w:t xml:space="preserve"> </w:t>
+                          </w:r>
+                          <w:r>
+                            <w:rPr>
+                              <w:color w:val="A09F9F"/>
+                              <w:spacing w:val="-8"/>
+                            </w:rPr>
+                            <w:t>6666898</w:t>
+                          </w:r>
+                        </w:p>
+                        <w:p>
+                          <w:pPr>
+                            <w:spacing w:line="219" w:lineRule="exact"/>
+                            <w:ind w:left="20"/>
+                            <w:rPr>
+                              <w:rFonts w:ascii="Gill Sans MT"/>
+                              <w:sz w:val="19"/>
+                            </w:rPr>
+                          </w:pPr>
+                          <w:r>
+                            <w:rPr>
+                              <w:rFonts w:ascii="Gill Sans MT"/>
+                              <w:color w:val="A09F9F"/>
+                              <w:sz w:val="19"/>
+                            </w:rPr>
+                            <w:t>Fax:</w:t>
+                          </w:r>
+                          <w:r>
+                            <w:rPr>
+                              <w:rFonts w:ascii="Gill Sans MT"/>
+                              <w:color w:val="A09F9F"/>
+                              <w:spacing w:val="-6"/>
+                              <w:sz w:val="19"/>
+                            </w:rPr>
+                            <w:t xml:space="preserve"> </w:t>
+                          </w:r>
+                          <w:r>
+                            <w:rPr>
+                              <w:rFonts w:ascii="Gill Sans MT"/>
+                              <w:color w:val="A09F9F"/>
+                              <w:sz w:val="19"/>
+                            </w:rPr>
+                            <w:t>+971</w:t>
+                          </w:r>
+                          <w:r>
+                            <w:rPr>
+                              <w:rFonts w:ascii="Gill Sans MT"/>
+                              <w:color w:val="A09F9F"/>
+                              <w:spacing w:val="-6"/>
+                              <w:sz w:val="19"/>
+                            </w:rPr>
+                            <w:t xml:space="preserve"> </w:t>
+                          </w:r>
+                          <w:r>
+                            <w:rPr>
+                              <w:rFonts w:ascii="Gill Sans MT"/>
+                              <w:color w:val="A09F9F"/>
+                              <w:sz w:val="19"/>
+                            </w:rPr>
+                            <w:t>2</w:t>
+                          </w:r>
+                          <w:r>
+                            <w:rPr>
+                              <w:rFonts w:ascii="Gill Sans MT"/>
+                              <w:color w:val="A09F9F"/>
+                              <w:spacing w:val="-6"/>
+                              <w:sz w:val="19"/>
+                            </w:rPr>
+                            <w:t xml:space="preserve"> </w:t>
+                          </w:r>
+                          <w:r>
+                            <w:rPr>
+                              <w:rFonts w:ascii="Gill Sans MT"/>
+                              <w:color w:val="A09F9F"/>
+                              <w:sz w:val="19"/>
+                            </w:rPr>
+                            <w:t>666</w:t>
+                          </w:r>
+                          <w:r>
+                            <w:rPr>
+                              <w:rFonts w:ascii="Gill Sans MT"/>
+                              <w:color w:val="A09F9F"/>
+                              <w:spacing w:val="-6"/>
+                              <w:sz w:val="19"/>
+                            </w:rPr>
+                            <w:t xml:space="preserve"> </w:t>
+                          </w:r>
+                          <w:r>
+                            <w:rPr>
+                              <w:rFonts w:ascii="Gill Sans MT"/>
+                              <w:color w:val="A09F9F"/>
+                              <w:spacing w:val="-4"/>
+                              <w:sz w:val="19"/>
+                            </w:rPr>
+                            <w:t>8980</w:t>
+                          </w:r>
+                        </w:p>
+                      </w:txbxContent>
+                    </v:textbox>
+                    <w10:wrap anchorx="page" anchory="page"/>
+                  </v:shape>
+                </w:pict>
+              </mc:Fallback>
+            </mc:AlternateContent>
           </w:r>
         </w:p>
+      </w:tc>
+      <w:tc>
+        <w:tcPr>
+          <w:tcW w:w="900" w:type="dxa"/>
+          <w:vAlign w:val="top"/>
+        </w:tcPr>
         <w:p>
           <w:pPr>
+            <w:pStyle w:val="Footer"/>
+            <w:spacing w:before="80" w:after="0"/>
             <w:jc w:val="right"/>
-            <w:rPr>
-              <w:rFonts w:ascii="Helvetica" w:hAnsi="Helvetica" w:cs="Open Sans"/>
-              <w:color w:val="FFFFFF" w:themeColor="background1"/>
-              <w:sz w:val="18"/>
-              <w:szCs w:val="18"/>
-            </w:rPr>
           </w:pPr>
           <w:r>
             <w:rPr>
-              <w:rFonts w:ascii="Helvetica" w:hAnsi="Helvetica" w:cs="Open Sans"/>
-              <w:color w:val="FFFFFF" w:themeColor="background1"/>
-              <w:sz w:val="18"/>
-              <w:szCs w:val="18"/>
+              <w:rFonts w:ascii="Helvetica" w:hAnsi="Helvetica"/>
+              <w:color w:val="A09F9F"/>
+              <w:sz w:val="16"/>
+              <w:szCs w:val="16"/>
             </w:rPr>
-            <w:t xml:space="preserve">Sheikh Zayed Bin Sultan Street              </w:t>
-          </w:r>
-        </w:p>
-        <w:p>
-          <w:pPr>
-            <w:jc w:val="right"/>
-            <w:rPr>
-              <w:rFonts w:ascii="Helvetica" w:hAnsi="Helvetica" w:cs="Open Sans"/>
-              <w:color w:val="FFFFFF" w:themeColor="background1"/>
-              <w:sz w:val="18"/>
-              <w:szCs w:val="18"/>
-            </w:rPr>
-          </w:pPr>
-          <w:r>
-            <w:rPr>
-              <w:rFonts w:ascii="Helvetica" w:hAnsi="Helvetica" w:cs="Open Sans"/>
-              <w:color w:val="FFFFFF" w:themeColor="background1"/>
-              <w:sz w:val="18"/>
-              <w:szCs w:val="18"/>
-            </w:rPr>
-            <w:t>Zone 1 – Ministries</w:t>
-          </w:r>
-          <w:r>
-            <w:rPr>
-              <w:rFonts w:ascii="Helvetica" w:hAnsi="Helvetica" w:cs="Open Sans"/>
-              <w:color w:val="FFFFFF" w:themeColor="background1"/>
-              <w:sz w:val="18"/>
-              <w:szCs w:val="18"/>
-            </w:rPr>
-            <w:t xml:space="preserve"> </w:t>
-          </w:r>
-          <w:r>
-            <w:rPr>
-              <w:rFonts w:ascii="Helvetica" w:hAnsi="Helvetica" w:cs="Open Sans"/>
-              <w:color w:val="FFFFFF" w:themeColor="background1"/>
-              <w:sz w:val="18"/>
-              <w:szCs w:val="18"/>
-            </w:rPr>
-            <w:t xml:space="preserve">Complex                  </w:t>
-          </w:r>
-        </w:p>
-        <w:p>
-          <w:pPr>
-            <w:jc w:val="right"/>
-            <w:rPr>
-              <w:rFonts w:ascii="Helvetica" w:hAnsi="Helvetica" w:cs="Open Sans"/>
-              <w:color w:val="FFFFFF" w:themeColor="background1"/>
-              <w:sz w:val="22"/>
-              <w:szCs w:val="22"/>
-            </w:rPr>
-          </w:pPr>
-          <w:r>
-            <w:rPr>
-              <w:rFonts w:ascii="Helvetica" w:hAnsi="Helvetica" w:cs="Open Sans"/>
-              <w:color w:val="FFFFFF" w:themeColor="background1"/>
-              <w:sz w:val="18"/>
-              <w:szCs w:val="18"/>
-            </w:rPr>
-            <w:t>Abu Dhabi, United Arab Emirates</w:t>
+            <w:t>{{ submitter_g }}</w:t>
           </w:r>
         </w:p>
       </w:tc>
@@ -1180,97 +2333,8 @@
     <w:r>
       <w:rPr>
         <w:rFonts w:ascii="Helvetica" w:hAnsi="Helvetica"/>
-        <w:noProof/>
-        <w:color w:val="FF0000"/>
-        <w:sz w:val="2"/>
-        <w:szCs w:val="2"/>
-      </w:rPr>
-      <mc:AlternateContent>
-        <mc:Choice Requires="wps">
-          <w:drawing>
-            <wp:anchor distT="0" distB="0" distL="114300" distR="114300" simplePos="0" relativeHeight="251661312" behindDoc="1" locked="0" layoutInCell="1" allowOverlap="1" wp14:anchorId="6228A4AD" wp14:editId="4C4266F9">
-              <wp:simplePos x="0" y="0"/>
-              <wp:positionH relativeFrom="page">
-                <wp:posOffset>-428625</wp:posOffset>
-              </wp:positionH>
-              <wp:positionV relativeFrom="paragraph">
-                <wp:posOffset>-733425</wp:posOffset>
-              </wp:positionV>
-              <wp:extent cx="7734300" cy="1181100"/>
-              <wp:effectExtent l="0" t="0" r="0" b="0"/>
-              <wp:wrapNone/>
-              <wp:docPr id="7" name="Triangle 7"/>
-              <wp:cNvGraphicFramePr/>
-              <a:graphic xmlns:a="http://schemas.openxmlformats.org/drawingml/2006/main">
-                <a:graphicData uri="http://schemas.microsoft.com/office/word/2010/wordprocessingShape">
-                  <wps:wsp>
-                    <wps:cNvSpPr/>
-                    <wps:spPr>
-                      <a:xfrm>
-                        <a:off x="0" y="0"/>
-                        <a:ext cx="7734300" cy="1181100"/>
-                      </a:xfrm>
-                      <a:prstGeom prst="triangle">
-                        <a:avLst>
-                          <a:gd name="adj" fmla="val 0"/>
-                        </a:avLst>
-                      </a:prstGeom>
-                      <a:solidFill>
-                        <a:srgbClr val="C20000"/>
-                      </a:solidFill>
-                      <a:ln>
-                        <a:noFill/>
-                      </a:ln>
-                    </wps:spPr>
-                    <wps:style>
-                      <a:lnRef idx="2">
-                        <a:schemeClr val="accent1">
-                          <a:shade val="50000"/>
-                        </a:schemeClr>
-                      </a:lnRef>
-                      <a:fillRef idx="1">
-                        <a:schemeClr val="accent1"/>
-                      </a:fillRef>
-                      <a:effectRef idx="0">
-                        <a:schemeClr val="accent1"/>
-                      </a:effectRef>
-                      <a:fontRef idx="minor">
-                        <a:schemeClr val="lt1"/>
-                      </a:fontRef>
-                    </wps:style>
-                    <wps:bodyPr rot="0" spcFirstLastPara="0" vertOverflow="overflow" horzOverflow="overflow" vert="horz" wrap="square" lIns="91440" tIns="45720" rIns="91440" bIns="45720" numCol="1" spcCol="0" rtlCol="0" fromWordArt="0" anchor="ctr" anchorCtr="0" forceAA="0" compatLnSpc="1">
-                      <a:prstTxWarp prst="textNoShape">
-                        <a:avLst/>
-                      </a:prstTxWarp>
-                      <a:noAutofit/>
-                    </wps:bodyPr>
-                  </wps:wsp>
-                </a:graphicData>
-              </a:graphic>
-              <wp14:sizeRelH relativeFrom="margin">
-                <wp14:pctWidth>0</wp14:pctWidth>
-              </wp14:sizeRelH>
-              <wp14:sizeRelV relativeFrom="margin">
-                <wp14:pctHeight>0</wp14:pctHeight>
-              </wp14:sizeRelV>
-            </wp:anchor>
-          </w:drawing>
-        </mc:Choice>
-        <mc:Fallback>
-          <w:pict>
-            <v:shape w14:anchorId="41CC72B0" id="Triangle 7" o:spid="_x0000_s1026" type="#_x0000_t5" style="position:absolute;margin-left:-33.75pt;margin-top:-57.75pt;width:609pt;height:93pt;z-index:-251655168;visibility:visible;mso-wrap-style:square;mso-width-percent:0;mso-height-percent:0;mso-wrap-distance-left:9pt;mso-wrap-distance-top:0;mso-wrap-distance-right:9pt;mso-wrap-distance-bottom:0;mso-position-horizontal:absolute;mso-position-horizontal-relative:page;mso-position-vertical:absolute;mso-position-vertical-relative:text;mso-width-percent:0;mso-height-percent:0;mso-width-relative:margin;mso-height-relative:margin;v-text-anchor:middle" o:gfxdata="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" adj="0" fillcolor="#c20000" stroked="f" strokeweight="1pt">
-              <w10:wrap anchorx="page"/>
-            </v:shape>
-          </w:pict>
-        </mc:Fallback>
-      </mc:AlternateContent>
-    </w:r>
-    <w:r>
-      <w:rPr>
-        <w:rFonts w:ascii="Helvetica" w:hAnsi="Helvetica"/>
-        <w:color w:val="FF0000"/>
-        <w:sz w:val="2"/>
-        <w:szCs w:val="2"/>
+        <w:sz w:val="18"/>
+        <w:szCs w:val="18"/>
       </w:rPr>
       <w:tab/>
     </w:r>
@@ -1299,408 +2363,233 @@
 
 <file path=word/header1.xml><?xml version="1.0" encoding="utf-8"?>
 <w:hdr xmlns:wpc="http://schemas.microsoft.com/office/word/2010/wordprocessingCanvas" xmlns:cx="http://schemas.microsoft.com/office/drawing/2014/chartex" xmlns:cx1="http://schemas.microsoft.com/office/drawing/2015/9/8/chartex" xmlns:cx2="http://schemas.microsoft.com/office/drawing/2015/10/21/chartex" xmlns:cx3="http://schemas.microsoft.com/office/drawing/2016/5/9/chartex" xmlns:cx4="http://schemas.microsoft.com/office/drawing/2016/5/10/chartex" xmlns:cx5="http://schemas.microsoft.com/office/drawing/2016/5/11/chartex" xmlns:cx6="http://schemas.microsoft.com/office/drawing/2016/5/12/chartex" xmlns:cx7="http://schemas.microsoft.com/office/drawing/2016/5/13/chartex" xmlns:cx8="http://schemas.microsoft.com/office/drawing/2016/5/14/chartex" xmlns:mc="http://schemas.openxmlformats.org/markup-compatibility/2006" xmlns:aink="http://schemas.microsoft.com/office/drawing/2016/ink" xmlns:am3d="http://schemas.microsoft.com/office/drawing/2017/model3d" xmlns:o="urn:schemas-microsoft-com:office:office" xmlns:oel="http://schemas.microsoft.com/office/2019/extlst" xmlns:r="http://schemas.openxmlformats.org/officeDocument/2006/relationships" xmlns:m="http://schemas.openxmlformats.org/officeDocument/2006/math" xmlns:v="urn:schemas-microsoft-com:vml" xmlns:wp14="http://schemas.microsoft.com/office/word/2010/wordprocessingDrawing" xmlns:wp="http://schemas.openxmlformats.org/drawingml/2006/wordprocessingDrawing" xmlns:w10="urn:schemas-microsoft-com:office:word" xmlns:w="http://schemas.openxmlformats.org/wordprocessingml/2006/main" xmlns:w14="http://schemas.microsoft.com/office/word/2010/wordml" xmlns:w15="http://schemas.microsoft.com/office/word/2012/wordml" xmlns:w16cex="http://schemas.microsoft.com/office/word/2018/wordml/cex" xmlns:w16cid="http://schemas.microsoft.com/office/word/2016/wordml/cid" xmlns:w16="http://schemas.microsoft.com/office/word/2018/wordml" xmlns:w16du="http://schemas.microsoft.com/office/word/2023/wordml/word16du" xmlns:w16sdtdh="http://schemas.microsoft.com/office/word/2020/wordml/sdtdatahash" xmlns:w16sdtfl="http://schemas.microsoft.com/office/word/2024/wordml/sdtformatlock" xmlns:w16se="http://schemas.microsoft.com/office/word/2015/wordml/symex" xmlns:wpg="http://schemas.microsoft.com/office/word/2010/wordprocessingGroup" xmlns:wpi="http://schemas.microsoft.com/office/word/2010/wordprocessingInk" xmlns:wne="http://schemas.microsoft.com/office/word/2006/wordml" xmlns:wps="http://schemas.microsoft.com/office/word/2010/wordprocessingShape" mc:Ignorable="w14 w15 w16se w16cid w16 w16cex w16sdtdh w16sdtfl w16du wp14">
-  <w:tbl>
-    <w:tblPr>
-      <w:tblStyle w:val="TableGrid"/>
-      <w:tblW w:w="11034" w:type="dxa"/>
-      <w:tblBorders>
-        <w:top w:val="none" w:sz="0" w:space="0" w:color="auto"/>
-        <w:left w:val="none" w:sz="0" w:space="0" w:color="auto"/>
-        <w:bottom w:val="none" w:sz="0" w:space="0" w:color="auto"/>
-        <w:right w:val="none" w:sz="0" w:space="0" w:color="auto"/>
-        <w:insideH w:val="none" w:sz="0" w:space="0" w:color="auto"/>
-        <w:insideV w:val="none" w:sz="0" w:space="0" w:color="auto"/>
-      </w:tblBorders>
-      <w:tblCellMar>
-        <w:left w:w="0" w:type="dxa"/>
-        <w:right w:w="0" w:type="dxa"/>
-      </w:tblCellMar>
-      <w:tblLook w:val="04A0" w:firstRow="1" w:lastRow="0" w:firstColumn="1" w:lastColumn="0" w:noHBand="0" w:noVBand="1"/>
-    </w:tblPr>
-    <w:tblGrid>
-      <w:gridCol w:w="601"/>
-      <w:gridCol w:w="6"/>
-      <w:gridCol w:w="6"/>
-      <w:gridCol w:w="1212"/>
-      <w:gridCol w:w="2066"/>
-      <w:gridCol w:w="6531"/>
-      <w:gridCol w:w="612"/>
-    </w:tblGrid>
-    <w:tr>
-      <w:trPr>
-        <w:gridBefore w:val="1"/>
-        <w:wBefore w:w="601" w:type="dxa"/>
-        <w:trHeight w:val="690"/>
-      </w:trPr>
-      <w:tc>
-        <w:tcPr>
-          <w:tcW w:w="6" w:type="dxa"/>
-          <w:tcMar>
-            <w:left w:w="0" w:type="dxa"/>
-            <w:right w:w="0" w:type="dxa"/>
-          </w:tcMar>
-          <w:vAlign w:val="center"/>
-        </w:tcPr>
-        <w:p>
-          <w:pPr>
-            <w:pStyle w:val="Header"/>
-            <w:tabs>
-              <w:tab w:val="clear" w:pos="4513"/>
-              <w:tab w:val="clear" w:pos="9026"/>
-              <w:tab w:val="left" w:pos="10396"/>
-              <w:tab w:val="right" w:pos="10466"/>
-            </w:tabs>
-          </w:pPr>
-        </w:p>
-      </w:tc>
-      <w:tc>
-        <w:tcPr>
-          <w:tcW w:w="6" w:type="dxa"/>
-          <w:tcMar>
-            <w:left w:w="0" w:type="dxa"/>
-            <w:right w:w="0" w:type="dxa"/>
-          </w:tcMar>
-          <w:vAlign w:val="center"/>
-        </w:tcPr>
-        <w:p>
-          <w:pPr>
-            <w:pStyle w:val="Header"/>
-            <w:tabs>
-              <w:tab w:val="clear" w:pos="4513"/>
-              <w:tab w:val="clear" w:pos="9026"/>
-              <w:tab w:val="left" w:pos="10396"/>
-              <w:tab w:val="right" w:pos="10466"/>
-            </w:tabs>
-          </w:pPr>
-        </w:p>
-      </w:tc>
-      <w:tc>
-        <w:tcPr>
-          <w:tcW w:w="10421" w:type="dxa"/>
-          <w:gridSpan w:val="4"/>
-          <w:tcMar>
-            <w:left w:w="0" w:type="dxa"/>
-            <w:right w:w="0" w:type="dxa"/>
-          </w:tcMar>
-          <w:vAlign w:val="center"/>
-        </w:tcPr>
-        <w:p>
-          <w:pPr>
-            <w:pStyle w:val="Header"/>
-            <w:tabs>
-              <w:tab w:val="clear" w:pos="4513"/>
-              <w:tab w:val="clear" w:pos="9026"/>
-              <w:tab w:val="left" w:pos="10396"/>
-              <w:tab w:val="right" w:pos="10466"/>
-            </w:tabs>
-            <w:jc w:val="right"/>
-            <w:rPr>
-              <w:rFonts w:ascii="Helvetica" w:hAnsi="Helvetica"/>
-              <w:b/>
-              <w:bCs/>
-              <w:sz w:val="22"/>
-              <w:szCs w:val="22"/>
-            </w:rPr>
-          </w:pPr>
-        </w:p>
-      </w:tc>
-    </w:tr>
-    <w:tr>
-      <w:trPr>
-        <w:gridBefore w:val="1"/>
-        <w:wBefore w:w="601" w:type="dxa"/>
-        <w:trHeight w:val="121"/>
-      </w:trPr>
-      <w:tc>
-        <w:tcPr>
-          <w:tcW w:w="6" w:type="dxa"/>
-          <w:tcMar>
-            <w:left w:w="0" w:type="dxa"/>
-            <w:right w:w="0" w:type="dxa"/>
-          </w:tcMar>
-          <w:vAlign w:val="center"/>
-        </w:tcPr>
-        <w:p>
-          <w:pPr>
-            <w:pStyle w:val="Header"/>
-            <w:tabs>
-              <w:tab w:val="clear" w:pos="4513"/>
-              <w:tab w:val="clear" w:pos="9026"/>
-              <w:tab w:val="left" w:pos="10396"/>
-              <w:tab w:val="right" w:pos="10466"/>
-            </w:tabs>
-          </w:pPr>
-        </w:p>
-      </w:tc>
-      <w:tc>
-        <w:tcPr>
-          <w:tcW w:w="6" w:type="dxa"/>
-          <w:tcMar>
-            <w:left w:w="0" w:type="dxa"/>
-            <w:right w:w="0" w:type="dxa"/>
-          </w:tcMar>
-          <w:vAlign w:val="center"/>
-        </w:tcPr>
-        <w:p>
-          <w:pPr>
-            <w:pStyle w:val="Header"/>
-            <w:tabs>
-              <w:tab w:val="clear" w:pos="4513"/>
-              <w:tab w:val="clear" w:pos="9026"/>
-              <w:tab w:val="left" w:pos="10396"/>
-              <w:tab w:val="right" w:pos="10466"/>
-            </w:tabs>
-          </w:pPr>
-        </w:p>
-      </w:tc>
-      <w:tc>
-        <w:tcPr>
-          <w:tcW w:w="10421" w:type="dxa"/>
-          <w:gridSpan w:val="4"/>
-          <w:tcMar>
-            <w:left w:w="0" w:type="dxa"/>
-            <w:right w:w="0" w:type="dxa"/>
-          </w:tcMar>
-          <w:vAlign w:val="center"/>
-        </w:tcPr>
-        <w:p>
-          <w:pPr>
-            <w:pStyle w:val="Header"/>
-            <w:tabs>
-              <w:tab w:val="clear" w:pos="4513"/>
-              <w:tab w:val="clear" w:pos="9026"/>
-              <w:tab w:val="left" w:pos="10396"/>
-              <w:tab w:val="right" w:pos="10466"/>
-            </w:tabs>
-            <w:jc w:val="center"/>
-            <w:rPr>
-              <w:noProof/>
-            </w:rPr>
-          </w:pPr>
-        </w:p>
-      </w:tc>
-    </w:tr>
-    <w:tr>
-      <w:trPr>
-        <w:gridAfter w:val="1"/>
-        <w:wAfter w:w="612" w:type="dxa"/>
-        <w:trHeight w:val="463"/>
-      </w:trPr>
-      <w:tc>
-        <w:tcPr>
-          <w:tcW w:w="1825" w:type="dxa"/>
-          <w:gridSpan w:val="4"/>
-          <w:hideMark/>
-        </w:tcPr>
-        <w:p>
-          <w:pPr>
-            <w:pStyle w:val="Header"/>
-            <w:tabs>
-              <w:tab w:val="clear" w:pos="4513"/>
-              <w:tab w:val="clear" w:pos="9026"/>
-              <w:tab w:val="left" w:pos="10396"/>
-              <w:tab w:val="right" w:pos="10466"/>
-            </w:tabs>
-            <w:jc w:val="center"/>
-          </w:pPr>
-          <w:r>
-            <w:rPr>
-              <w:noProof/>
-            </w:rPr>
-            <w:drawing>
-              <wp:inline distT="0" distB="0" distL="0" distR="0" wp14:anchorId="29306CAA" wp14:editId="41C57645">
-                <wp:extent cx="1009650" cy="1027520"/>
-                <wp:effectExtent l="0" t="0" r="0" b="1270"/>
-                <wp:docPr id="683820999" name="Picture 683820999" descr="Logo&#10;&#10;Description automatically generated"/>
-                <wp:cNvGraphicFramePr>
-                  <a:graphicFrameLocks xmlns:a="http://schemas.openxmlformats.org/drawingml/2006/main" noChangeAspect="1"/>
-                </wp:cNvGraphicFramePr>
-                <a:graphic xmlns:a="http://schemas.openxmlformats.org/drawingml/2006/main">
-                  <a:graphicData uri="http://schemas.openxmlformats.org/drawingml/2006/picture">
-                    <pic:pic xmlns:pic="http://schemas.openxmlformats.org/drawingml/2006/picture">
-                      <pic:nvPicPr>
-                        <pic:cNvPr id="1" name="Picture 1" descr="Logo&#10;&#10;Description automatically generated"/>
-                        <pic:cNvPicPr/>
-                      </pic:nvPicPr>
-                      <pic:blipFill>
-                        <a:blip r:embed="rId1">
-                          <a:extLst>
-                            <a:ext uri="{28A0092B-C50C-407E-A947-70E740481C1C}">
-                              <a14:useLocalDpi xmlns:a14="http://schemas.microsoft.com/office/drawing/2010/main" val="0"/>
-                            </a:ext>
-                          </a:extLst>
-                        </a:blip>
-                        <a:stretch>
-                          <a:fillRect/>
-                        </a:stretch>
-                      </pic:blipFill>
-                      <pic:spPr>
-                        <a:xfrm>
-                          <a:off x="0" y="0"/>
-                          <a:ext cx="1023560" cy="1041676"/>
-                        </a:xfrm>
-                        <a:prstGeom prst="rect">
-                          <a:avLst/>
-                        </a:prstGeom>
-                      </pic:spPr>
-                    </pic:pic>
-                  </a:graphicData>
-                </a:graphic>
-              </wp:inline>
-            </w:drawing>
-          </w:r>
-        </w:p>
-      </w:tc>
-      <w:tc>
-        <w:tcPr>
-          <w:tcW w:w="2066" w:type="dxa"/>
-          <w:vAlign w:val="center"/>
-          <w:hideMark/>
-        </w:tcPr>
-        <w:p>
-          <w:pPr>
-            <w:pStyle w:val="Header"/>
-            <w:tabs>
-              <w:tab w:val="clear" w:pos="4513"/>
-              <w:tab w:val="clear" w:pos="9026"/>
-              <w:tab w:val="left" w:pos="10396"/>
-              <w:tab w:val="right" w:pos="10466"/>
-            </w:tabs>
-            <w:jc w:val="center"/>
-          </w:pPr>
-          <w:r>
-            <w:rPr>
-              <w:noProof/>
-            </w:rPr>
-            <w:drawing>
-              <wp:inline distT="0" distB="0" distL="0" distR="0" wp14:anchorId="4F571DF7" wp14:editId="5C2571F5">
-                <wp:extent cx="1152525" cy="771525"/>
-                <wp:effectExtent l="0" t="0" r="9525" b="9525"/>
-                <wp:docPr id="1513273273" name="Picture 1513273273"/>
-                <wp:cNvGraphicFramePr>
-                  <a:graphicFrameLocks xmlns:a="http://schemas.openxmlformats.org/drawingml/2006/main" noChangeAspect="1"/>
-                </wp:cNvGraphicFramePr>
-                <a:graphic xmlns:a="http://schemas.openxmlformats.org/drawingml/2006/main">
-                  <a:graphicData uri="http://schemas.openxmlformats.org/drawingml/2006/picture">
-                    <pic:pic xmlns:pic="http://schemas.openxmlformats.org/drawingml/2006/picture">
-                      <pic:nvPicPr>
-                        <pic:cNvPr id="0" name="Picture 75"/>
-                        <pic:cNvPicPr>
-                          <a:picLocks noChangeAspect="1" noChangeArrowheads="1"/>
-                        </pic:cNvPicPr>
-                      </pic:nvPicPr>
-                      <pic:blipFill>
-                        <a:blip r:embed="rId2">
-                          <a:extLst>
-                            <a:ext uri="{28A0092B-C50C-407E-A947-70E740481C1C}">
-                              <a14:useLocalDpi xmlns:a14="http://schemas.microsoft.com/office/drawing/2010/main" val="0"/>
-                            </a:ext>
-                          </a:extLst>
-                        </a:blip>
-                        <a:srcRect/>
-                        <a:stretch>
-                          <a:fillRect/>
-                        </a:stretch>
-                      </pic:blipFill>
-                      <pic:spPr bwMode="auto">
-                        <a:xfrm>
-                          <a:off x="0" y="0"/>
-                          <a:ext cx="1152525" cy="771525"/>
-                        </a:xfrm>
-                        <a:prstGeom prst="rect">
-                          <a:avLst/>
-                        </a:prstGeom>
-                        <a:noFill/>
-                        <a:ln>
-                          <a:noFill/>
-                        </a:ln>
-                      </pic:spPr>
-                    </pic:pic>
-                  </a:graphicData>
-                </a:graphic>
-              </wp:inline>
-            </w:drawing>
-          </w:r>
-        </w:p>
-      </w:tc>
-      <w:tc>
-        <w:tcPr>
-          <w:tcW w:w="6531" w:type="dxa"/>
-          <w:vAlign w:val="center"/>
-          <w:hideMark/>
-        </w:tcPr>
-        <w:p>
-          <w:pPr>
-            <w:pStyle w:val="Header"/>
-            <w:tabs>
-              <w:tab w:val="clear" w:pos="4513"/>
-              <w:tab w:val="clear" w:pos="9026"/>
-              <w:tab w:val="left" w:pos="10396"/>
-              <w:tab w:val="right" w:pos="10466"/>
-            </w:tabs>
-            <w:jc w:val="center"/>
-            <w:rPr>
-              <w:rFonts w:ascii="Tahoma" w:hAnsi="Tahoma" w:cs="Tahoma"/>
-              <w:b/>
-              <w:bCs/>
-              <w:color w:val="323E4F" w:themeColor="text2" w:themeShade="BF"/>
-              <w:sz w:val="40"/>
-              <w:szCs w:val="40"/>
-              <w:lang w:bidi="ar-AE"/>
-            </w:rPr>
-          </w:pPr>
-          <w:r>
-            <w:rPr>
-              <w:rFonts w:ascii="Tahoma" w:hAnsi="Tahoma" w:cs="Tahoma"/>
-              <w:b/>
-              <w:bCs/>
-              <w:color w:val="323E4F" w:themeColor="text2" w:themeShade="BF"/>
-              <w:sz w:val="40"/>
-              <w:szCs w:val="40"/>
-              <w:rtl/>
-              <w:lang w:bidi="ar-AE"/>
-            </w:rPr>
-            <w:t>المجموعة العالمية للخدمات الأمنية</w:t>
-          </w:r>
-        </w:p>
-        <w:p>
-          <w:pPr>
-            <w:pStyle w:val="Header"/>
-            <w:tabs>
-              <w:tab w:val="clear" w:pos="4513"/>
-              <w:tab w:val="clear" w:pos="9026"/>
-              <w:tab w:val="left" w:pos="10396"/>
-              <w:tab w:val="right" w:pos="10466"/>
-            </w:tabs>
-            <w:jc w:val="center"/>
-            <w:rPr>
-              <w:rFonts w:ascii="Ebrima" w:hAnsi="Ebrima"/>
-              <w:b/>
-              <w:bCs/>
-              <w:color w:val="B5031C"/>
-              <w:sz w:val="36"/>
-              <w:szCs w:val="36"/>
-              <w:rtl/>
-            </w:rPr>
-          </w:pPr>
-          <w:r>
-            <w:rPr>
-              <w:rFonts w:ascii="Ebrima" w:hAnsi="Ebrima"/>
-              <w:b/>
-              <w:bCs/>
-              <w:color w:val="B5031C"/>
-              <w:sz w:val="36"/>
-              <w:szCs w:val="36"/>
-            </w:rPr>
-            <w:t>GLOBAL SECURITY SERVICES GROUP</w:t>
-          </w:r>
-        </w:p>
-      </w:tc>
-    </w:tr>
-  </w:tbl>
+  <w:p>
+    <w:pPr>
+      <w:bidi/>
+      <w:rPr>
+        <w:rFonts w:ascii="Sakkal Majalla" w:hAnsi="Sakkal Majalla" w:cs="Sakkal Majalla"/>
+        <w:sz w:val="32"/>
+        <w:szCs w:val="32"/>
+        <w:rtl/>
+      </w:rPr>
+    </w:pPr>
+    <w:r>
+      <w:rPr>
+        <w:rFonts w:ascii="Times New Roman"/>
+        <w:noProof/>
+        <w:sz w:val="20"/>
+      </w:rPr>
+      <w:drawing>
+        <wp:anchor distT="0" distB="0" distL="114300" distR="114300" simplePos="0" relativeHeight="251665408" behindDoc="0" locked="0" layoutInCell="1" allowOverlap="1" wp14:anchorId="523C1A82" wp14:editId="6DF37BEC">
+          <wp:simplePos x="0" y="0"/>
+          <wp:positionH relativeFrom="column">
+            <wp:posOffset>-378943</wp:posOffset>
+          </wp:positionH>
+          <wp:positionV relativeFrom="paragraph">
+            <wp:posOffset>-406807</wp:posOffset>
+          </wp:positionV>
+          <wp:extent cx="3129915" cy="1043305"/>
+          <wp:effectExtent l="0" t="0" r="0" b="0"/>
+          <wp:wrapNone/>
+          <wp:docPr id="1230103377" name="Picture 17"/>
+          <wp:cNvGraphicFramePr>
+            <a:graphicFrameLocks xmlns:a="http://schemas.openxmlformats.org/drawingml/2006/main" noChangeAspect="1"/>
+          </wp:cNvGraphicFramePr>
+          <a:graphic xmlns:a="http://schemas.openxmlformats.org/drawingml/2006/main">
+            <a:graphicData uri="http://schemas.openxmlformats.org/drawingml/2006/picture">
+              <pic:pic xmlns:pic="http://schemas.openxmlformats.org/drawingml/2006/picture">
+                <pic:nvPicPr>
+                  <pic:cNvPr id="0" name="Picture 1"/>
+                  <pic:cNvPicPr>
+                    <a:picLocks noChangeAspect="1" noChangeArrowheads="1"/>
+                  </pic:cNvPicPr>
+                </pic:nvPicPr>
+                <pic:blipFill>
+                  <a:blip r:embed="rId1">
+                    <a:extLst>
+                      <a:ext uri="{28A0092B-C50C-407E-A947-70E740481C1C}">
+                        <a14:useLocalDpi xmlns:a14="http://schemas.microsoft.com/office/drawing/2010/main" val="0"/>
+                      </a:ext>
+                    </a:extLst>
+                  </a:blip>
+                  <a:srcRect/>
+                  <a:stretch>
+                    <a:fillRect/>
+                  </a:stretch>
+                </pic:blipFill>
+                <pic:spPr bwMode="auto">
+                  <a:xfrm>
+                    <a:off x="0" y="0"/>
+                    <a:ext cx="3129915" cy="1043305"/>
+                  </a:xfrm>
+                  <a:prstGeom prst="rect">
+                    <a:avLst/>
+                  </a:prstGeom>
+                  <a:noFill/>
+                  <a:ln>
+                    <a:noFill/>
+                  </a:ln>
+                </pic:spPr>
+              </pic:pic>
+            </a:graphicData>
+          </a:graphic>
+          <wp14:sizeRelH relativeFrom="margin">
+            <wp14:pctWidth>0</wp14:pctWidth>
+          </wp14:sizeRelH>
+          <wp14:sizeRelV relativeFrom="margin">
+            <wp14:pctHeight>0</wp14:pctHeight>
+          </wp14:sizeRelV>
+        </wp:anchor>
+      </w:drawing>
+    </w:r>
+    <w:proofErr w:type="gramStart"/>
+    <w:proofErr w:type="spellStart"/>
+    <w:proofErr w:type="spellEnd"/>
+    <w:proofErr w:type="gramEnd"/>
+  </w:p>
+  <w:p>
+    <w:pPr>
+      <w:bidi/>
+      <w:rPr>
+        <w:rFonts w:ascii="Sakkal Majalla" w:hAnsi="Sakkal Majalla" w:cs="Sakkal Majalla"/>
+        <w:sz w:val="32"/>
+        <w:szCs w:val="32"/>
+        <w:rtl/>
+      </w:rPr>
+    </w:pPr>
+  </w:p>
   <w:p>
     <w:pPr>
       <w:pStyle w:val="Header"/>
+      <w:jc w:val="center"/>
+      <w:rPr>
+        <w:rFonts w:ascii="Sakkal Majalla" w:hAnsi="Sakkal Majalla" w:cs="Sakkal Majalla"/>
+        <w:sz w:val="56"/>
+        <w:szCs w:val="56"/>
+        <w:rtl/>
+        <w:lang w:val="en-AE" w:bidi="ar-AE"/>
+      </w:rPr>
+    </w:pPr>
+    <w:r>
+      <w:rPr>
+        <w:rFonts w:ascii="Cronos Pro" w:hAnsi="Cronos Pro"/>
+        <w:b/>
+        <w:bCs/>
+        <w:noProof/>
+        <w:color w:val="767171" w:themeColor="background2" w:themeShade="80"/>
+      </w:rPr>
+      <mc:AlternateContent>
+        <mc:Choice Requires="wps">
+          <w:drawing>
+            <wp:anchor distT="0" distB="0" distL="0" distR="0" simplePos="0" relativeHeight="251667456" behindDoc="0" locked="0" layoutInCell="1" allowOverlap="1" wp14:anchorId="1A9A3D4E" wp14:editId="6706867A">
+              <wp:simplePos x="0" y="0"/>
+              <wp:positionH relativeFrom="page">
+                <wp:posOffset>911073</wp:posOffset>
+              </wp:positionH>
+              <wp:positionV relativeFrom="page">
+                <wp:posOffset>1753159</wp:posOffset>
+              </wp:positionV>
+              <wp:extent cx="6642100" cy="198120"/>
+              <wp:effectExtent l="0" t="0" r="6350" b="0"/>
+              <wp:wrapNone/>
+              <wp:docPr id="1549930454" name="Graphic 7"/>
+              <wp:cNvGraphicFramePr>
+                <a:graphicFrameLocks xmlns:a="http://schemas.openxmlformats.org/drawingml/2006/main"/>
+              </wp:cNvGraphicFramePr>
+              <a:graphic xmlns:a="http://schemas.openxmlformats.org/drawingml/2006/main">
+                <a:graphicData uri="http://schemas.microsoft.com/office/word/2010/wordprocessingShape">
+                  <wps:wsp>
+                    <wps:cNvSpPr>
+                      <a:spLocks/>
+                    </wps:cNvSpPr>
+                    <wps:spPr>
+                      <a:xfrm>
+                        <a:off x="0" y="0"/>
+                        <a:ext cx="6642100" cy="198120"/>
+                      </a:xfrm>
+                      <a:custGeom>
+                        <a:avLst/>
+                        <a:gdLst/>
+                        <a:ahLst/>
+                        <a:cxnLst/>
+                        <a:rect l="l" t="t" r="r" b="b"/>
+                        <a:pathLst>
+                          <a:path w="6642100" h="198120">
+                            <a:moveTo>
+                              <a:pt x="6641998" y="0"/>
+                            </a:moveTo>
+                            <a:lnTo>
+                              <a:pt x="4313593" y="0"/>
+                            </a:lnTo>
+                            <a:lnTo>
+                              <a:pt x="4313593" y="95618"/>
+                            </a:lnTo>
+                            <a:lnTo>
+                              <a:pt x="0" y="95618"/>
+                            </a:lnTo>
+                            <a:lnTo>
+                              <a:pt x="0" y="98894"/>
+                            </a:lnTo>
+                            <a:lnTo>
+                              <a:pt x="4313593" y="98894"/>
+                            </a:lnTo>
+                            <a:lnTo>
+                              <a:pt x="4313593" y="197789"/>
+                            </a:lnTo>
+                            <a:lnTo>
+                              <a:pt x="6641998" y="197789"/>
+                            </a:lnTo>
+                            <a:lnTo>
+                              <a:pt x="6641998" y="98894"/>
+                            </a:lnTo>
+                            <a:lnTo>
+                              <a:pt x="6641998" y="95618"/>
+                            </a:lnTo>
+                            <a:lnTo>
+                              <a:pt x="6641998" y="0"/>
+                            </a:lnTo>
+                            <a:close/>
+                          </a:path>
+                        </a:pathLst>
+                      </a:custGeom>
+                      <a:solidFill>
+                        <a:srgbClr val="B92027"/>
+                      </a:solidFill>
+                    </wps:spPr>
+                    <wps:bodyPr wrap="square" lIns="0" tIns="0" rIns="0" bIns="0" rtlCol="0">
+                      <a:prstTxWarp prst="textNoShape">
+                        <a:avLst/>
+                      </a:prstTxWarp>
+                      <a:noAutofit/>
+                    </wps:bodyPr>
+                  </wps:wsp>
+                </a:graphicData>
+              </a:graphic>
+            </wp:anchor>
+          </w:drawing>
+        </mc:Choice>
+        <mc:Fallback>
+          <w:pict>
+            <v:shape w14:anchorId="030664B0" id="Graphic 7" o:spid="_x0000_s1026" style="position:absolute;margin-left:71.75pt;margin-top:138.05pt;width:523pt;height:15.6pt;z-index:251667456;visibility:visible;mso-wrap-style:square;mso-wrap-distance-left:0;mso-wrap-distance-top:0;mso-wrap-distance-right:0;mso-wrap-distance-bottom:0;mso-position-horizontal:absolute;mso-position-horizontal-relative:page;mso-position-vertical:absolute;mso-position-vertical-relative:page;v-text-anchor:top" coordsize="6642100,198120" o:gfxdata="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" path="m6641998,l4313593,r,95618l,95618r,3276l4313593,98894r,98895l6641998,197789r,-98895l6641998,95618r,-95618xe" fillcolor="#b92027" stroked="f">
+              <v:path arrowok="t"/>
+              <w10:wrap anchorx="page" anchory="page"/>
+            </v:shape>
+          </w:pict>
+        </mc:Fallback>
+      </mc:AlternateContent>
+    </w:r>
+  </w:p>
+  <w:p>
+    <w:pPr>
+      <w:pStyle w:val="Header"/>
+      <w:jc w:val="center"/>
+      <w:rPr>
+        <w:rFonts w:ascii="Sakkal Majalla" w:hAnsi="Sakkal Majalla" w:cs="Sakkal Majalla"/>
+        <w:sz w:val="56"/>
+        <w:szCs w:val="56"/>
+        <w:rtl/>
+        <w:lang w:val="en-AE" w:bidi="ar-AE"/>
+      </w:rPr>
     </w:pPr>
   </w:p>
 </w:hdr>
@@ -1708,282 +2597,279 @@
 
 <file path=word/header2.xml><?xml version="1.0" encoding="utf-8"?>
 <w:hdr xmlns:wpc="http://schemas.microsoft.com/office/word/2010/wordprocessingCanvas" xmlns:cx="http://schemas.microsoft.com/office/drawing/2014/chartex" xmlns:cx1="http://schemas.microsoft.com/office/drawing/2015/9/8/chartex" xmlns:cx2="http://schemas.microsoft.com/office/drawing/2015/10/21/chartex" xmlns:cx3="http://schemas.microsoft.com/office/drawing/2016/5/9/chartex" xmlns:cx4="http://schemas.microsoft.com/office/drawing/2016/5/10/chartex" xmlns:cx5="http://schemas.microsoft.com/office/drawing/2016/5/11/chartex" xmlns:cx6="http://schemas.microsoft.com/office/drawing/2016/5/12/chartex" xmlns:cx7="http://schemas.microsoft.com/office/drawing/2016/5/13/chartex" xmlns:cx8="http://schemas.microsoft.com/office/drawing/2016/5/14/chartex" xmlns:mc="http://schemas.openxmlformats.org/markup-compatibility/2006" xmlns:aink="http://schemas.microsoft.com/office/drawing/2016/ink" xmlns:am3d="http://schemas.microsoft.com/office/drawing/2017/model3d" xmlns:o="urn:schemas-microsoft-com:office:office" xmlns:oel="http://schemas.microsoft.com/office/2019/extlst" xmlns:r="http://schemas.openxmlformats.org/officeDocument/2006/relationships" xmlns:m="http://schemas.openxmlformats.org/officeDocument/2006/math" xmlns:v="urn:schemas-microsoft-com:vml" xmlns:wp14="http://schemas.microsoft.com/office/word/2010/wordprocessingDrawing" xmlns:wp="http://schemas.openxmlformats.org/drawingml/2006/wordprocessingDrawing" xmlns:w10="urn:schemas-microsoft-com:office:word" xmlns:w="http://schemas.openxmlformats.org/wordprocessingml/2006/main" xmlns:w14="http://schemas.microsoft.com/office/word/2010/wordml" xmlns:w15="http://schemas.microsoft.com/office/word/2012/wordml" xmlns:w16cex="http://schemas.microsoft.com/office/word/2018/wordml/cex" xmlns:w16cid="http://schemas.microsoft.com/office/word/2016/wordml/cid" xmlns:w16="http://schemas.microsoft.com/office/word/2018/wordml" xmlns:w16du="http://schemas.microsoft.com/office/word/2023/wordml/word16du" xmlns:w16sdtdh="http://schemas.microsoft.com/office/word/2020/wordml/sdtdatahash" xmlns:w16sdtfl="http://schemas.microsoft.com/office/word/2024/wordml/sdtformatlock" xmlns:w16se="http://schemas.microsoft.com/office/word/2015/wordml/symex" xmlns:wpg="http://schemas.microsoft.com/office/word/2010/wordprocessingGroup" xmlns:wpi="http://schemas.microsoft.com/office/word/2010/wordprocessingInk" xmlns:wne="http://schemas.microsoft.com/office/word/2006/wordml" xmlns:wps="http://schemas.microsoft.com/office/word/2010/wordprocessingShape" mc:Ignorable="w14 w15 w16se w16cid w16 w16cex w16sdtdh w16sdtfl w16du wp14">
-  <w:tbl>
-    <w:tblPr>
-      <w:tblStyle w:val="TableGrid"/>
-      <w:tblW w:w="11625" w:type="dxa"/>
-      <w:tblInd w:w="-450" w:type="dxa"/>
-      <w:tblBorders>
-        <w:top w:val="none" w:sz="0" w:space="0" w:color="auto"/>
-        <w:left w:val="none" w:sz="0" w:space="0" w:color="auto"/>
-        <w:bottom w:val="none" w:sz="0" w:space="0" w:color="auto"/>
-        <w:right w:val="none" w:sz="0" w:space="0" w:color="auto"/>
-        <w:insideH w:val="none" w:sz="0" w:space="0" w:color="auto"/>
-        <w:insideV w:val="none" w:sz="0" w:space="0" w:color="auto"/>
-      </w:tblBorders>
-      <w:tblCellMar>
-        <w:left w:w="0" w:type="dxa"/>
-        <w:right w:w="0" w:type="dxa"/>
-      </w:tblCellMar>
-      <w:tblLook w:val="04A0" w:firstRow="1" w:lastRow="0" w:firstColumn="1" w:lastColumn="0" w:noHBand="0" w:noVBand="1"/>
-    </w:tblPr>
-    <w:tblGrid>
-      <w:gridCol w:w="2030"/>
-      <w:gridCol w:w="2306"/>
-      <w:gridCol w:w="7289"/>
-    </w:tblGrid>
-    <w:tr>
-      <w:trPr>
-        <w:trHeight w:val="647"/>
-      </w:trPr>
-      <w:tc>
-        <w:tcPr>
-          <w:tcW w:w="2030" w:type="dxa"/>
-          <w:hideMark/>
-        </w:tcPr>
-        <w:p>
-          <w:pPr>
-            <w:pStyle w:val="Header"/>
-            <w:tabs>
-              <w:tab w:val="clear" w:pos="4513"/>
-              <w:tab w:val="clear" w:pos="9026"/>
-              <w:tab w:val="left" w:pos="10396"/>
-              <w:tab w:val="right" w:pos="10466"/>
-            </w:tabs>
-            <w:jc w:val="center"/>
-          </w:pPr>
-          <w:bookmarkStart w:id="0" w:name="_Hlk118357222"/>
-          <w:bookmarkStart w:id="1" w:name="_Hlk118357223"/>
-          <w:r>
-            <w:rPr>
-              <w:noProof/>
-            </w:rPr>
-            <w:drawing>
-              <wp:anchor distT="0" distB="0" distL="114300" distR="114300" simplePos="0" relativeHeight="251665408" behindDoc="1" locked="0" layoutInCell="1" allowOverlap="1" wp14:anchorId="6942DBF2" wp14:editId="44FCC3FB">
-                <wp:simplePos x="0" y="0"/>
-                <wp:positionH relativeFrom="column">
-                  <wp:posOffset>288544</wp:posOffset>
-                </wp:positionH>
-                <wp:positionV relativeFrom="paragraph">
-                  <wp:posOffset>-204774</wp:posOffset>
-                </wp:positionV>
-                <wp:extent cx="548640" cy="558165"/>
-                <wp:effectExtent l="0" t="0" r="3810" b="0"/>
-                <wp:wrapNone/>
-                <wp:docPr id="614770599" name="Picture 614770599" descr="Logo&#10;&#10;Description automatically generated"/>
-                <wp:cNvGraphicFramePr>
-                  <a:graphicFrameLocks xmlns:a="http://schemas.openxmlformats.org/drawingml/2006/main" noChangeAspect="1"/>
-                </wp:cNvGraphicFramePr>
-                <a:graphic xmlns:a="http://schemas.openxmlformats.org/drawingml/2006/main">
-                  <a:graphicData uri="http://schemas.openxmlformats.org/drawingml/2006/picture">
-                    <pic:pic xmlns:pic="http://schemas.openxmlformats.org/drawingml/2006/picture">
-                      <pic:nvPicPr>
-                        <pic:cNvPr id="1" name="Picture 1" descr="Logo&#10;&#10;Description automatically generated"/>
-                        <pic:cNvPicPr/>
-                      </pic:nvPicPr>
-                      <pic:blipFill>
-                        <a:blip r:embed="rId1">
-                          <a:extLst>
-                            <a:ext uri="{28A0092B-C50C-407E-A947-70E740481C1C}">
-                              <a14:useLocalDpi xmlns:a14="http://schemas.microsoft.com/office/drawing/2010/main" val="0"/>
-                            </a:ext>
-                          </a:extLst>
-                        </a:blip>
-                        <a:stretch>
-                          <a:fillRect/>
-                        </a:stretch>
-                      </pic:blipFill>
-                      <pic:spPr>
-                        <a:xfrm>
-                          <a:off x="0" y="0"/>
-                          <a:ext cx="548640" cy="558165"/>
-                        </a:xfrm>
-                        <a:prstGeom prst="rect">
-                          <a:avLst/>
-                        </a:prstGeom>
-                      </pic:spPr>
-                    </pic:pic>
-                  </a:graphicData>
-                </a:graphic>
-                <wp14:sizeRelH relativeFrom="margin">
-                  <wp14:pctWidth>0</wp14:pctWidth>
-                </wp14:sizeRelH>
-                <wp14:sizeRelV relativeFrom="margin">
-                  <wp14:pctHeight>0</wp14:pctHeight>
-                </wp14:sizeRelV>
-              </wp:anchor>
-            </w:drawing>
-          </w:r>
-        </w:p>
-      </w:tc>
-      <w:tc>
-        <w:tcPr>
-          <w:tcW w:w="2306" w:type="dxa"/>
-          <w:vAlign w:val="center"/>
-          <w:hideMark/>
-        </w:tcPr>
-        <w:p>
-          <w:pPr>
-            <w:pStyle w:val="Header"/>
-            <w:tabs>
-              <w:tab w:val="clear" w:pos="4513"/>
-              <w:tab w:val="clear" w:pos="9026"/>
-              <w:tab w:val="left" w:pos="10396"/>
-              <w:tab w:val="right" w:pos="10466"/>
-            </w:tabs>
-            <w:jc w:val="center"/>
-          </w:pPr>
-          <w:r>
-            <w:rPr>
-              <w:noProof/>
-            </w:rPr>
-            <w:drawing>
-              <wp:anchor distT="0" distB="0" distL="114300" distR="114300" simplePos="0" relativeHeight="251664384" behindDoc="1" locked="0" layoutInCell="1" allowOverlap="1" wp14:anchorId="2FF751B2" wp14:editId="3E05E784">
-                <wp:simplePos x="0" y="0"/>
-                <wp:positionH relativeFrom="margin">
-                  <wp:posOffset>-241935</wp:posOffset>
-                </wp:positionH>
-                <wp:positionV relativeFrom="paragraph">
-                  <wp:posOffset>-249555</wp:posOffset>
-                </wp:positionV>
-                <wp:extent cx="767715" cy="526415"/>
-                <wp:effectExtent l="0" t="0" r="0" b="6985"/>
-                <wp:wrapNone/>
-                <wp:docPr id="1459547876" name="Picture 1459547876"/>
-                <wp:cNvGraphicFramePr>
-                  <a:graphicFrameLocks xmlns:a="http://schemas.openxmlformats.org/drawingml/2006/main" noChangeAspect="1"/>
-                </wp:cNvGraphicFramePr>
-                <a:graphic xmlns:a="http://schemas.openxmlformats.org/drawingml/2006/main">
-                  <a:graphicData uri="http://schemas.openxmlformats.org/drawingml/2006/picture">
-                    <pic:pic xmlns:pic="http://schemas.openxmlformats.org/drawingml/2006/picture">
-                      <pic:nvPicPr>
-                        <pic:cNvPr id="0" name="Picture 75"/>
-                        <pic:cNvPicPr>
-                          <a:picLocks noChangeAspect="1" noChangeArrowheads="1"/>
-                        </pic:cNvPicPr>
-                      </pic:nvPicPr>
-                      <pic:blipFill>
-                        <a:blip r:embed="rId2">
-                          <a:extLst>
-                            <a:ext uri="{28A0092B-C50C-407E-A947-70E740481C1C}">
-                              <a14:useLocalDpi xmlns:a14="http://schemas.microsoft.com/office/drawing/2010/main" val="0"/>
-                            </a:ext>
-                          </a:extLst>
-                        </a:blip>
-                        <a:srcRect/>
-                        <a:stretch>
-                          <a:fillRect/>
-                        </a:stretch>
-                      </pic:blipFill>
-                      <pic:spPr bwMode="auto">
-                        <a:xfrm>
-                          <a:off x="0" y="0"/>
-                          <a:ext cx="767715" cy="526415"/>
-                        </a:xfrm>
-                        <a:prstGeom prst="rect">
-                          <a:avLst/>
-                        </a:prstGeom>
-                        <a:noFill/>
-                        <a:ln>
-                          <a:noFill/>
-                        </a:ln>
-                      </pic:spPr>
-                    </pic:pic>
-                  </a:graphicData>
-                </a:graphic>
-                <wp14:sizeRelH relativeFrom="margin">
-                  <wp14:pctWidth>0</wp14:pctWidth>
-                </wp14:sizeRelH>
-                <wp14:sizeRelV relativeFrom="margin">
-                  <wp14:pctHeight>0</wp14:pctHeight>
-                </wp14:sizeRelV>
-              </wp:anchor>
-            </w:drawing>
-          </w:r>
-        </w:p>
-      </w:tc>
-      <w:tc>
-        <w:tcPr>
-          <w:tcW w:w="7289" w:type="dxa"/>
-          <w:vAlign w:val="center"/>
-          <w:hideMark/>
-        </w:tcPr>
-        <w:p>
-          <w:pPr>
-            <w:pStyle w:val="Header"/>
-            <w:tabs>
-              <w:tab w:val="clear" w:pos="4513"/>
-              <w:tab w:val="clear" w:pos="9026"/>
-              <w:tab w:val="left" w:pos="10396"/>
-              <w:tab w:val="right" w:pos="10466"/>
-            </w:tabs>
-            <w:ind w:left="720"/>
-            <w:jc w:val="center"/>
-            <w:rPr>
-              <w:rFonts w:ascii="Tahoma" w:hAnsi="Tahoma" w:cs="Tahoma"/>
-              <w:b/>
-              <w:bCs/>
-              <w:color w:val="323E4F" w:themeColor="text2" w:themeShade="BF"/>
-              <w:sz w:val="28"/>
-              <w:szCs w:val="28"/>
-              <w:lang w:bidi="ar-AE"/>
-            </w:rPr>
-          </w:pPr>
-          <w:r>
-            <w:rPr>
-              <w:rFonts w:ascii="Tahoma" w:hAnsi="Tahoma" w:cs="Tahoma"/>
-              <w:b/>
-              <w:bCs/>
-              <w:color w:val="323E4F" w:themeColor="text2" w:themeShade="BF"/>
-              <w:sz w:val="28"/>
-              <w:szCs w:val="28"/>
-              <w:rtl/>
-              <w:lang w:bidi="ar-AE"/>
-            </w:rPr>
-            <w:t>المجموعة العالمية للخدمات الأمنية</w:t>
-          </w:r>
-        </w:p>
-        <w:p>
-          <w:pPr>
-            <w:pStyle w:val="Header"/>
-            <w:tabs>
-              <w:tab w:val="clear" w:pos="4513"/>
-              <w:tab w:val="clear" w:pos="9026"/>
-              <w:tab w:val="left" w:pos="10396"/>
-              <w:tab w:val="right" w:pos="10466"/>
-            </w:tabs>
-            <w:ind w:left="720"/>
-            <w:jc w:val="center"/>
-            <w:rPr>
-              <w:rFonts w:ascii="Ebrima" w:hAnsi="Ebrima"/>
-              <w:b/>
-              <w:bCs/>
-              <w:color w:val="B5031C"/>
-              <w:sz w:val="28"/>
-              <w:szCs w:val="28"/>
-              <w:rtl/>
-            </w:rPr>
-          </w:pPr>
-          <w:r>
-            <w:rPr>
-              <w:rFonts w:ascii="Ebrima" w:hAnsi="Ebrima"/>
-              <w:b/>
-              <w:bCs/>
-              <w:color w:val="B5031C"/>
-              <w:sz w:val="20"/>
-              <w:szCs w:val="20"/>
-            </w:rPr>
-            <w:t>GLOBAL SECURITY SERVICES GROUP</w:t>
-          </w:r>
-        </w:p>
-      </w:tc>
-    </w:tr>
-    <w:bookmarkEnd w:id="0"/>
-    <w:bookmarkEnd w:id="1"/>
-  </w:tbl>
+  <w:p>
+    <w:pPr>
+      <w:bidi/>
+      <w:rPr>
+        <w:rFonts w:ascii="Sakkal Majalla" w:hAnsi="Sakkal Majalla" w:cs="Sakkal Majalla"/>
+        <w:sz w:val="32"/>
+        <w:szCs w:val="32"/>
+        <w:rtl/>
+      </w:rPr>
+    </w:pPr>
+    <w:r>
+      <w:rPr>
+        <w:rFonts w:ascii="Times New Roman"/>
+        <w:noProof/>
+        <w:sz w:val="20"/>
+      </w:rPr>
+      <w:drawing>
+        <wp:anchor distT="0" distB="0" distL="114300" distR="114300" simplePos="0" relativeHeight="251665408" behindDoc="0" locked="0" layoutInCell="1" allowOverlap="1" wp14:anchorId="523C1A82" wp14:editId="6DF37BEC">
+          <wp:simplePos x="0" y="0"/>
+          <wp:positionH relativeFrom="column">
+            <wp:posOffset>-378943</wp:posOffset>
+          </wp:positionH>
+          <wp:positionV relativeFrom="paragraph">
+            <wp:posOffset>-406807</wp:posOffset>
+          </wp:positionV>
+          <wp:extent cx="3129915" cy="1043305"/>
+          <wp:effectExtent l="0" t="0" r="0" b="0"/>
+          <wp:wrapNone/>
+          <wp:docPr id="1230103377" name="Picture 17"/>
+          <wp:cNvGraphicFramePr>
+            <a:graphicFrameLocks xmlns:a="http://schemas.openxmlformats.org/drawingml/2006/main" noChangeAspect="1"/>
+          </wp:cNvGraphicFramePr>
+          <a:graphic xmlns:a="http://schemas.openxmlformats.org/drawingml/2006/main">
+            <a:graphicData uri="http://schemas.openxmlformats.org/drawingml/2006/picture">
+              <pic:pic xmlns:pic="http://schemas.openxmlformats.org/drawingml/2006/picture">
+                <pic:nvPicPr>
+                  <pic:cNvPr id="0" name="Picture 1"/>
+                  <pic:cNvPicPr>
+                    <a:picLocks noChangeAspect="1" noChangeArrowheads="1"/>
+                  </pic:cNvPicPr>
+                </pic:nvPicPr>
+                <pic:blipFill>
+                  <a:blip r:embed="rId1">
+                    <a:extLst>
+                      <a:ext uri="{28A0092B-C50C-407E-A947-70E740481C1C}">
+                        <a14:useLocalDpi xmlns:a14="http://schemas.microsoft.com/office/drawing/2010/main" val="0"/>
+                      </a:ext>
+                    </a:extLst>
+                  </a:blip>
+                  <a:srcRect/>
+                  <a:stretch>
+                    <a:fillRect/>
+                  </a:stretch>
+                </pic:blipFill>
+                <pic:spPr bwMode="auto">
+                  <a:xfrm>
+                    <a:off x="0" y="0"/>
+                    <a:ext cx="3129915" cy="1043305"/>
+                  </a:xfrm>
+                  <a:prstGeom prst="rect">
+                    <a:avLst/>
+                  </a:prstGeom>
+                  <a:noFill/>
+                  <a:ln>
+                    <a:noFill/>
+                  </a:ln>
+                </pic:spPr>
+              </pic:pic>
+            </a:graphicData>
+          </a:graphic>
+          <wp14:sizeRelH relativeFrom="margin">
+            <wp14:pctWidth>0</wp14:pctWidth>
+          </wp14:sizeRelH>
+          <wp14:sizeRelV relativeFrom="margin">
+            <wp14:pctHeight>0</wp14:pctHeight>
+          </wp14:sizeRelV>
+        </wp:anchor>
+      </w:drawing>
+    </w:r>
+    <w:r>
+      <w:rPr>
+        <w:rFonts w:ascii="Sakkal Majalla" w:hAnsi="Sakkal Majalla" w:cs="Sakkal Majalla" w:hint="cs"/>
+        <w:sz w:val="32"/>
+        <w:szCs w:val="32"/>
+        <w:rtl/>
+      </w:rPr>
+      <w:t xml:space="preserve">التاريخ: </w:t>
+    </w:r>
+    <w:proofErr w:type="gramStart"/>
+    <w:r>
+      <w:rPr>
+        <w:rFonts w:ascii="Sakkal Majalla" w:hAnsi="Sakkal Majalla" w:cs="Sakkal Majalla" w:hint="cs"/>
+        <w:sz w:val="32"/>
+        <w:szCs w:val="32"/>
+        <w:rtl/>
+      </w:rPr>
+      <w:t xml:space="preserve">{{ </w:t>
+    </w:r>
+    <w:proofErr w:type="spellStart"/>
+    <w:r>
+      <w:rPr>
+        <w:rFonts w:ascii="Sakkal Majalla" w:hAnsi="Sakkal Majalla" w:cs="Sakkal Majalla" w:hint="cs"/>
+        <w:sz w:val="32"/>
+        <w:szCs w:val="32"/>
+        <w:rtl/>
+      </w:rPr>
+      <w:t>date</w:t>
+    </w:r>
+    <w:proofErr w:type="spellEnd"/>
+    <w:proofErr w:type="gramEnd"/>
+    <w:r>
+      <w:rPr>
+        <w:rFonts w:ascii="Sakkal Majalla" w:hAnsi="Sakkal Majalla" w:cs="Sakkal Majalla" w:hint="cs"/>
+        <w:sz w:val="32"/>
+        <w:szCs w:val="32"/>
+        <w:rtl/>
+      </w:rPr>
+      <w:t xml:space="preserve"> }}</w:t>
+    </w:r>
+  </w:p>
+  <w:p>
+    <w:pPr>
+      <w:bidi/>
+      <w:rPr>
+        <w:rFonts w:ascii="Sakkal Majalla" w:hAnsi="Sakkal Majalla" w:cs="Sakkal Majalla"/>
+        <w:sz w:val="32"/>
+        <w:szCs w:val="32"/>
+        <w:rtl/>
+      </w:rPr>
+    </w:pPr>
+  </w:p>
   <w:p>
     <w:pPr>
       <w:pStyle w:val="Header"/>
+      <w:jc w:val="center"/>
+      <w:rPr>
+        <w:rFonts w:ascii="Sakkal Majalla" w:hAnsi="Sakkal Majalla" w:cs="Sakkal Majalla"/>
+        <w:sz w:val="56"/>
+        <w:szCs w:val="56"/>
+        <w:rtl/>
+        <w:lang w:val="en-AE" w:bidi="ar-AE"/>
+      </w:rPr>
+    </w:pPr>
+    <w:r>
+      <w:rPr>
+        <w:rFonts w:ascii="Cronos Pro" w:hAnsi="Cronos Pro"/>
+        <w:b/>
+        <w:bCs/>
+        <w:noProof/>
+        <w:color w:val="767171" w:themeColor="background2" w:themeShade="80"/>
+      </w:rPr>
+      <mc:AlternateContent>
+        <mc:Choice Requires="wps">
+          <w:drawing>
+            <wp:anchor distT="0" distB="0" distL="0" distR="0" simplePos="0" relativeHeight="251667456" behindDoc="0" locked="0" layoutInCell="1" allowOverlap="1" wp14:anchorId="1A9A3D4E" wp14:editId="6706867A">
+              <wp:simplePos x="0" y="0"/>
+              <wp:positionH relativeFrom="page">
+                <wp:posOffset>911073</wp:posOffset>
+              </wp:positionH>
+              <wp:positionV relativeFrom="page">
+                <wp:posOffset>1753159</wp:posOffset>
+              </wp:positionV>
+              <wp:extent cx="6642100" cy="198120"/>
+              <wp:effectExtent l="0" t="0" r="6350" b="0"/>
+              <wp:wrapNone/>
+              <wp:docPr id="1549930454" name="Graphic 7"/>
+              <wp:cNvGraphicFramePr>
+                <a:graphicFrameLocks xmlns:a="http://schemas.openxmlformats.org/drawingml/2006/main"/>
+              </wp:cNvGraphicFramePr>
+              <a:graphic xmlns:a="http://schemas.openxmlformats.org/drawingml/2006/main">
+                <a:graphicData uri="http://schemas.microsoft.com/office/word/2010/wordprocessingShape">
+                  <wps:wsp>
+                    <wps:cNvSpPr>
+                      <a:spLocks/>
+                    </wps:cNvSpPr>
+                    <wps:spPr>
+                      <a:xfrm>
+                        <a:off x="0" y="0"/>
+                        <a:ext cx="6642100" cy="198120"/>
+                      </a:xfrm>
+                      <a:custGeom>
+                        <a:avLst/>
+                        <a:gdLst/>
+                        <a:ahLst/>
+                        <a:cxnLst/>
+                        <a:rect l="l" t="t" r="r" b="b"/>
+                        <a:pathLst>
+                          <a:path w="6642100" h="198120">
+                            <a:moveTo>
+                              <a:pt x="6641998" y="0"/>
+                            </a:moveTo>
+                            <a:lnTo>
+                              <a:pt x="4313593" y="0"/>
+                            </a:lnTo>
+                            <a:lnTo>
+                              <a:pt x="4313593" y="95618"/>
+                            </a:lnTo>
+                            <a:lnTo>
+                              <a:pt x="0" y="95618"/>
+                            </a:lnTo>
+                            <a:lnTo>
+                              <a:pt x="0" y="98894"/>
+                            </a:lnTo>
+                            <a:lnTo>
+                              <a:pt x="4313593" y="98894"/>
+                            </a:lnTo>
+                            <a:lnTo>
+                              <a:pt x="4313593" y="197789"/>
+                            </a:lnTo>
+                            <a:lnTo>
+                              <a:pt x="6641998" y="197789"/>
+                            </a:lnTo>
+                            <a:lnTo>
+                              <a:pt x="6641998" y="98894"/>
+                            </a:lnTo>
+                            <a:lnTo>
+                              <a:pt x="6641998" y="95618"/>
+                            </a:lnTo>
+                            <a:lnTo>
+                              <a:pt x="6641998" y="0"/>
+                            </a:lnTo>
+                            <a:close/>
+                          </a:path>
+                        </a:pathLst>
+                      </a:custGeom>
+                      <a:solidFill>
+                        <a:srgbClr val="B92027"/>
+                      </a:solidFill>
+                    </wps:spPr>
+                    <wps:bodyPr wrap="square" lIns="0" tIns="0" rIns="0" bIns="0" rtlCol="0">
+                      <a:prstTxWarp prst="textNoShape">
+                        <a:avLst/>
+                      </a:prstTxWarp>
+                      <a:noAutofit/>
+                    </wps:bodyPr>
+                  </wps:wsp>
+                </a:graphicData>
+              </a:graphic>
+            </wp:anchor>
+          </w:drawing>
+        </mc:Choice>
+        <mc:Fallback>
+          <w:pict>
+            <v:shape w14:anchorId="030664B0" id="Graphic 7" o:spid="_x0000_s1026" style="position:absolute;margin-left:71.75pt;margin-top:138.05pt;width:523pt;height:15.6pt;z-index:251667456;visibility:visible;mso-wrap-style:square;mso-wrap-distance-left:0;mso-wrap-distance-top:0;mso-wrap-distance-right:0;mso-wrap-distance-bottom:0;mso-position-horizontal:absolute;mso-position-horizontal-relative:page;mso-position-vertical:absolute;mso-position-vertical-relative:page;v-text-anchor:top" coordsize="6642100,198120" o:gfxdata="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" path="m6641998,l4313593,r,95618l,95618r,3276l4313593,98894r,98895l6641998,197789r,-98895l6641998,95618r,-95618xe" fillcolor="#b92027" stroked="f">
+              <v:path arrowok="t"/>
+              <w10:wrap anchorx="page" anchory="page"/>
+            </v:shape>
+          </w:pict>
+        </mc:Fallback>
+      </mc:AlternateContent>
+    </w:r>
+    <w:r>
+      <w:rPr>
+        <w:rFonts w:ascii="Sakkal Majalla" w:hAnsi="Sakkal Majalla" w:cs="Sakkal Majalla"/>
+        <w:sz w:val="56"/>
+        <w:szCs w:val="56"/>
+        <w:rtl/>
+        <w:lang w:val="en-AE" w:bidi="ar-AE"/>
+      </w:rPr>
+      <w:t>تقرير</w:t>
+    </w:r>
+  </w:p>
+  <w:p>
+    <w:pPr>
+      <w:pStyle w:val="Header"/>
+      <w:jc w:val="center"/>
+      <w:rPr>
+        <w:rFonts w:ascii="Sakkal Majalla" w:hAnsi="Sakkal Majalla" w:cs="Sakkal Majalla"/>
+        <w:sz w:val="56"/>
+        <w:szCs w:val="56"/>
+        <w:rtl/>
+        <w:lang w:val="en-AE" w:bidi="ar-AE"/>
+      </w:rPr>
     </w:pPr>
   </w:p>
 </w:hdr>
@@ -3561,7 +4447,7 @@
     <w:lsdException w:name="Closing" w:semiHidden="1" w:unhideWhenUsed="1"/>
     <w:lsdException w:name="Signature" w:semiHidden="1" w:unhideWhenUsed="1"/>
     <w:lsdException w:name="Default Paragraph Font" w:semiHidden="1" w:uiPriority="1" w:unhideWhenUsed="1"/>
-    <w:lsdException w:name="Body Text" w:semiHidden="1" w:unhideWhenUsed="1"/>
+    <w:lsdException w:name="Body Text" w:semiHidden="1" w:uiPriority="1" w:unhideWhenUsed="1" w:qFormat="1"/>
     <w:lsdException w:name="Body Text Indent" w:semiHidden="1" w:unhideWhenUsed="1"/>
     <w:lsdException w:name="List Continue" w:semiHidden="1" w:unhideWhenUsed="1"/>
     <w:lsdException w:name="List Continue 2" w:semiHidden="1" w:unhideWhenUsed="1"/>
@@ -3875,6 +4761,7 @@
   <w:style w:type="paragraph" w:default="1" w:styleId="Normal">
     <w:name w:val="Normal"/>
     <w:qFormat/>
+    <w:rsid w:val="00CC4693"/>
     <w:rPr>
       <w:lang w:val="en-GB"/>
     </w:rPr>
@@ -4039,6 +4926,38 @@
     <w:rPr>
       <w:color w:val="605E5C"/>
       <w:shd w:val="clear" w:color="auto" w:fill="E1DFDD"/>
+    </w:rPr>
+  </w:style>
+  <w:style w:type="paragraph" w:styleId="BodyText">
+    <w:name w:val="Body Text"/>
+    <w:basedOn w:val="Normal"/>
+    <w:link w:val="BodyTextChar"/>
+    <w:uiPriority w:val="1"/>
+    <w:qFormat/>
+    <w:rsid w:val="0025514A"/>
+    <w:pPr>
+      <w:widowControl w:val="0"/>
+      <w:autoSpaceDE w:val="0"/>
+      <w:autoSpaceDN w:val="0"/>
+    </w:pPr>
+    <w:rPr>
+      <w:rFonts w:ascii="Myanmar MN" w:eastAsia="Myanmar MN" w:hAnsi="Myanmar MN" w:cs="Myanmar MN"/>
+      <w:sz w:val="18"/>
+      <w:szCs w:val="18"/>
+      <w:lang w:val="en-US"/>
+    </w:rPr>
+  </w:style>
+  <w:style w:type="character" w:customStyle="1" w:styleId="BodyTextChar">
+    <w:name w:val="Body Text Char"/>
+    <w:basedOn w:val="DefaultParagraphFont"/>
+    <w:link w:val="BodyText"/>
+    <w:uiPriority w:val="1"/>
+    <w:rsid w:val="0025514A"/>
+    <w:rPr>
+      <w:rFonts w:ascii="Myanmar MN" w:eastAsia="Myanmar MN" w:hAnsi="Myanmar MN" w:cs="Myanmar MN"/>
+      <w:sz w:val="18"/>
+      <w:szCs w:val="18"/>
+      <w:lang w:val="en-US"/>
     </w:rPr>
   </w:style>
 </w:styles>

</xml_diff>